<commit_message>
Auto commit (2026-10-07 10:13) — 2 changes
Claude Code 세션 종료 시 자동 커밋.

Co-Authored-By: Claude <noreply@anthropic.com>
</commit_message>
<xml_diff>
--- a/projects/리메이크 러프 기획안 11종_v4.docx
+++ b/projects/리메이크 러프 기획안 11종_v4.docx
@@ -748,7 +748,7 @@
           <w:b w:val="0"/>
           <w:sz w:val="21"/>
         </w:rPr>
-        <w:t>스무 해 뒤, 세 오빠의 맹세는 바네사가 독차지한다. 진짜 공주 아이비는 발목에 노예 방울을 찬 채 용 똥을 치우며, 자기를 때리며 키운 거스를 아버지라 부른다. 세 오빠 누구도 그 막내가 용 사육장 바닥에 있다는 걸 모른다.</w:t>
+        <w:t>스무 해 뒤, 세 오빠의 사랑은 바네사가 독차지한다. 진짜 공주 아이비는 발목에 노예 방울을 찬 채 용 똥을 치우며, 자기를 때리며 키운 거스를 아버지라 부른다. 세 오빠 누구도 그 막내가 용 사육장 바닥에 있다는 걸 모른다.</w:t>
       </w:r>
     </w:p>
     <w:p>
@@ -820,7 +820,7 @@
           <w:b w:val="0"/>
           <w:sz w:val="21"/>
         </w:rPr>
-        <w:t>아이비는 감독관이 등을 돌린 틈에 그 은화 주머니를 낚아채, 쇠사슬을 끌며 투기장 명부 앞까지 달린다. 귀족 아가씨들은 코를 막고 용 똥 냄새가 난다며 웃고, 등록관은 인간 이름을 적을 칸은 없다며 명부를 덮는다. 아이비가 탁자에 은화를 쏟자, 그 은화를 손끝으로 세던 세바스찬은 똥 묻은 은화도 은화라며 명부에 이름 대신 '용 똥 치우는 계집'이라고 적게 한다. 그렇게 적힌 계집이 친동생이라는 걸 세바스찬은 모른다.</w:t>
+        <w:t>아이비는 감독관이 등을 돌린 틈에 그 은화 주머니를 낚아채, 쇠사슬을 끌며 투기장 명부 앞까지 달린다. 귀족 아가씨들은 코를 막고 용 똥 냄새가 난다며 웃고, 등록관은 인간 이름을 적을 칸은 없다며 명부를 덮는다. 아이비가 탁자에 은화를 쏟자, 투기장을 맡은 둘째 오빠 세바스찬은 그 은화를 손끝으로 세다가 똥 묻은 은화도 은화라며 명부에 이름 대신 '용 똥 치우는 계집'이라고 적게 한다. 그렇게 적힌 계집이 친동생이라는 걸 세바스찬은 모른다.</w:t>
       </w:r>
     </w:p>
     <w:p>
@@ -863,7 +863,7 @@
           <w:b w:val="0"/>
           <w:sz w:val="21"/>
         </w:rPr>
-        <w:t>도미닉의 불이 아이비의 얼굴 앞에서 멈춘다. 하늘에서 내려선 용왕이 맨손으로 그 불을 쥐어 끈 것이다. 바네사는 용왕에게 매달려, 저 노예가 엄마 팔찌를 훔치려 했고 불씨 없는 공주는 이걸 찰 자격도 없다고 했다며 운다. 웨슬리가 떨어진 걸 주워 줬을 뿐이라고 나서지만, 용왕은 왕비가 남긴 팔찌와 딸에게 한꺼번에 손을 댔느냐며 손바닥을 내리누른다. 보이지 않는 무게에 아이비의 무릎이 돌바닥에 박힌다. 용왕이 딸이라 감싸는 바네사는 거스의 딸이고, 진짜 딸은 지금 용왕의 손바닥 아래 짓눌려 있다.</w:t>
+        <w:t>도미닉의 불이 아이비의 얼굴 앞에서 멈춘다. 하늘에서 내려선 용왕이 맨손으로 그 불을 쥐어 끈 것이다. 바네사는 용왕에게 매달려, 저 노예가 엄마 팔찌를 훔치려 했고 불씨 없는 공주는 이걸 찰 자격도 없다고 했다며 운다. 웨슬리가 떨어진 걸 주워 줬을 뿐이라고 나서지만, 용왕은 왕비가 남긴 팔찌에 노예 손을 대고 내 딸까지 울렸느냐며 손바닥을 내리누른다. 보이지 않는 무게에 아이비의 무릎이 돌바닥에 박힌다. 용왕이 딸이라 감싸는 바네사는 거스의 딸이고, 진짜 딸은 지금 용왕의 손바닥 아래 짓눌려 있다.</w:t>
       </w:r>
     </w:p>
     <w:p>
@@ -949,7 +949,7 @@
           <w:b w:val="0"/>
           <w:sz w:val="21"/>
         </w:rPr>
-        <w:t>그날 밤, 웨슬리 손에서 무엇이 탔는지 모르는 바네사가 팔찌를 촛불에 대 보고 가슴에 눌러 봐도, 팔찌는 다시 불을 켜지 않는다. 바네사는 팔찌를 시녀에게 던지며, 내일 그 노예만 죽으면 엄마 팔찌는 다시 자기한테만 불을 켤 거라고 말한다. 그런 바네사는 자기가 용 사육장 일꾼 거스의 딸이라는 걸 모른다.</w:t>
+        <w:t>그날 밤, 바네사가 팔찌를 촛불에 대 보고 가슴에 눌러 봐도 팔찌는 다시 불을 켜지 않는다. 바네사는 팔찌를 시녀에게 던지며, 내일 그 노예만 죽으면 엄마 팔찌는 다시 자기한테만 불을 켤 거라고 말한다. 그런 바네사는 자기가 용 사육장 일꾼 거스의 딸이라는 걸 모른다.</w:t>
       </w:r>
     </w:p>
     <w:p>
@@ -992,7 +992,7 @@
           <w:b w:val="0"/>
           <w:sz w:val="21"/>
         </w:rPr>
-        <w:t>그 외침이 울리는 모래판 입구에서, 웨슬리는 자기가 아이비의 몸값을 치를 테니 오늘은 물러서라고 붙잡는다. 아이비는 망토를 벗어 웨슬리 손에 돌려준다. 「날 사겠다는 거잖아. 이번엔 내 발로 나가.」 도미닉은 노예 하나에 두 손을 쓰면 용족 망신이라며 오른손을 등 뒤로 돌리지만, 사육장에서 용 머리를 눌러 온 손으로 아이비가 도미닉의 왼팔을 꺾어 모래에 메다꽂는다.</w:t>
+        <w:t>그 외침이 울리는 모래판 입구에서, 웨슬리는 자기가 아이비의 몸값을 치를 테니 오늘은 물러서라고 붙잡는다. 아이비는 망토를 벗어 웨슬리 손에 돌려준다. 「몸값 치르면 날 사는 거잖아. 이번엔 내 발로 싸우러 나가.」 도미닉은 노예 하나에 두 손을 쓰면 용족 망신이라며 오른손을 등 뒤로 돌리지만, 사육장에서 용 머리를 눌러 온 손으로 아이비가 도미닉의 왼팔을 꺾어 모래에 메다꽂는다.</w:t>
       </w:r>
     </w:p>
     <w:p>
@@ -1006,7 +1006,7 @@
           <w:b w:val="0"/>
           <w:sz w:val="21"/>
         </w:rPr>
-        <w:t>관람석에서 비명이 터지고, 일어선 도미닉은 등 뒤의 손까지 풀어 아이비를 모래에 짓누르고, 발목 방울을 밟아 딸랑 울린다. 「들려? 이게 네 이름이야.」 웨슬리가 난간을 넘으려다 경비들에게 붙잡히자, 바네사는 지금 태우라고 비명을 지른다. 도미닉의 붉은 불이 아이비를 덮치는 순간, 아이비의 두 눈이 하얗게 타오르고 두 손에서 흰 불이 터져 나온다. 맨 앞줄의 바네사가 손목을 움켜쥐고 비명을 지른다. 왕비의 팔찌가 하얗게 달아올라 바네사의 살을 태우고 있다. 옥좌에서 일어선 용왕이 스무 해 전 죽은 왕비와 같은 흰 불을 보며 중얼거린다. 「여보…….」</w:t>
+        <w:t>관람석에서 비명이 터지고, 일어선 도미닉은 등 뒤의 손까지 풀어 아이비를 모래에 짓누르고, 발목 방울을 밟아 딸랑 울린다. 「들려? 노예 방울 소리. 이게 너야.」 웨슬리가 난간을 넘으려다 경비들에게 붙잡히자, 바네사는 지금 태우라고 비명을 지른다. 도미닉의 붉은 불이 아이비를 덮치는 순간, 아이비의 두 눈이 하얗게 타오르고 두 손에서 흰 불이 터져 나온다. 맨 앞줄의 바네사가 손목을 움켜쥐고 비명을 지른다. 왕비의 팔찌가 하얗게 달아올라 바네사의 살을 태우고 있다. 옥좌에서 일어선 용왕이 스무 해 전 죽은 왕비와 같은 흰 불을 보며 중얼거린다. 「여보…….」</w:t>
       </w:r>
     </w:p>
     <w:p>
@@ -1419,7 +1419,7 @@
           <w:b w:val="0"/>
           <w:sz w:val="21"/>
         </w:rPr>
-        <w:t>감독관은 고철 칼을 화덕에 던져 넣는다. 오웬이 집게로 불 속을 뒤져 벌겋게 달아오른 칼을 끄집어내자, 얼은 이를 악문다. 저 아이가 대장간 문을 나서는 날, 왕자 자리에 앉힌 친아들 빅터가 끌려 내려온다. 그때 왕실 투기장이 열린다는 북소리가 울리고, 올해 우승자는 노예라도 사슬을 풀고 용왕의 기사가 된다는 외침이 대장간까지 들린다. 그 용왕이 친아버지라는 걸 모르는 오웬은, 아직 식지 않은 칼을 물통에 담그며 이 칼로 발목 사슬부터 끊겠다고 다짐한다.</w:t>
+        <w:t>감독관은 고철 칼을 화덕에 던져 넣는다. 오웬이 집게로 불 속을 뒤져 벌겋게 달아오른 칼을 끄집어내자, 얼은 이를 악문다. 저 아이가 대장간 문을 나서는 날, 자기가 왕자 자리에 앉힌 친아들 빅터가 끌려 내려온다는 걸 알기 때문이다. 그때 왕실 투기장이 열린다는 북소리가 울리고, 올해 우승자는 노예라도 사슬을 풀고 용왕의 기사가 된다는 외침이 대장간까지 들린다. 그 용왕이 친아버지라는 걸 모르는 오웬은, 아직 식지 않은 칼을 물통에 담그며 이 칼로 발목 사슬부터 끊겠다고 다짐한다.</w:t>
       </w:r>
     </w:p>
     <w:p>
@@ -1448,7 +1448,7 @@
           <w:b w:val="0"/>
           <w:sz w:val="21"/>
         </w:rPr>
-        <w:t>그 칼을 들고 찾아간 투기장 명부 앞에서, 귀족들은 성도 없는 노예는 사람 칸에 못 적는다며 명부 맨 끝 짐승 칸에 오웬의 이름을 적는다. 올해 첫 판에 나서는 빅터 왕자가 몸 풀기 좋은 고깃덩이가 왔다는 웃음이 따라붙는다.</w:t>
+        <w:t>그 칼을 들고 찾아간 투기장 명부 앞에서, 귀족들은 성도 없는 노예는 사람 칸에 못 적는다며 명부 맨 끝 짐승 칸에 오웬의 이름을 적는다. 빅터 왕자의 첫 판 몸풀이 상대로 딱 좋은 고깃덩이가 왔다며 귀족들이 웃는다.</w:t>
       </w:r>
     </w:p>
     <w:p>
@@ -1990,7 +1990,7 @@
           <w:b w:val="0"/>
           <w:sz w:val="21"/>
         </w:rPr>
-        <w:t>2년 동안 남친 타일러 쇼 한 사람만 찍느라 프로 구단의 사진 인턴 제안까지 거절한 스무 살 사진 전공생 몰리 터너. 크리스마스이브 밤에 우승컵 주인이 정해지는 3연전 홀리데이 시리즈 첫날, 몰리는 3주 동안 뜬 커플 루돌프 스웨터 한 벌은 입고 한 벌은 선물 상자에 담아 관중석에 선다. 노스필드 베어스 주장 타일러의 상대는 리지웨이 램스의 주장이자 크리스마스 파티마다 다른 여자를 데려오는 체이스 워커다. 체이스는 몰리가 카메라를 댄 링크 유리벽에 입김을 불어 자기 등번호 17을 써 놓고, 질색하는 몰리를 보며 속으로 중얼거린다. 「올해 크리스마스 소원은 저 루돌프 스웨터 입은 여자다.」 몰리는 체이스가 오래전부터 자기를 좋아해 왔다는 걸 모른다. 관중석만 보던 체이스의 스케이트에 퍽이 맞고 램스 골문으로 들어가, 베어스가 자책골 하나로 첫 경기를 가져간다. 선물 상자를 안고 라커룸 문을 연 몰리는, 룸메이트 브리트니가 타일러의 9번 유니폼 하나만 걸친 채 타일러 무릎 위에 올라앉아 있는 걸 본다. 몰리는 소리 지르는 대신 카메라를 들어 셔터를 누른다.</w:t>
+        <w:t>2년 동안 남친 타일러 쇼 한 사람만 찍느라 프로 구단의 사진 인턴 제안까지 거절한 스무 살 사진 전공생 몰리 터너. 크리스마스이브 밤에 우승컵 주인이 정해지는 3연전 홀리데이 시리즈 첫날, 몰리는 3주 동안 뜨개질해 타일러 등번호 9를 넣은 커플 루돌프 스웨터 한 벌은 입고 한 벌은 선물 상자에 담아 관중석에 선다. 노스필드 베어스 주장 타일러의 상대는 리지웨이 램스의 주장이자 크리스마스 파티마다 다른 여자를 데려오는 체이스 워커다. 체이스는 몰리가 카메라를 댄 링크 유리벽에 입김을 불어 자기 등번호 17을 써 놓고, 질색하는 몰리를 보며 속으로 중얼거린다. 「올해 크리스마스 소원은 저 루돌프 스웨터 입은 여자다.」 몰리는 체이스가 오래전부터 자기를 좋아해 왔다는 걸 모른다. 관중석만 보던 체이스의 스케이트에 퍽이 맞고 램스 골문으로 들어가, 베어스가 자책골 하나로 첫 경기를 가져간다. 선물 상자를 안고 라커룸 문을 연 몰리는, 룸메이트 브리트니가 타일러의 9번 유니폼 하나만 걸친 채 타일러 무릎 위에 올라앉아 있는 걸 본다. 몰리는 소리 지르는 대신 카메라를 들어 셔터를 누른다.</w:t>
       </w:r>
     </w:p>
     <w:p>
@@ -2019,7 +2019,7 @@
           <w:b w:val="0"/>
           <w:sz w:val="21"/>
         </w:rPr>
-        <w:t>플래시에 눈을 찡그린 타일러는 미안해하기는커녕 브리트니 허리를 더 끌어당기고, 몰리랑 자는 건 크리스마스에 양말 받는 기분이라고, 안 뜯어 봐도 뭔지 안다며 비웃는다. 브리트니는 어젯밤 둘이 몰리가 기숙사 방에 꾸며 놓은 트리 아래에서 잤다고 웃고, 선물 상자에서 커플 스웨터를 꺼내 타일러의 스케이트 날을 닦는다. 날에 걸린 털실이 줄줄 풀려 나가고, 타일러는 주장 여자 친구가 털실이나 들고 다녀 창피했다며 상자를 바닥에 던진다.</w:t>
+        <w:t>플래시에 눈을 찡그린 타일러는 미안해하기는커녕 브리트니 허리를 더 끌어당기고, 몰리랑 자는 건 크리스마스 양말 선물처럼 안 뜯어 봐도 뻔하고 재미없다며 비웃는다. 브리트니는 어젯밤 둘이 몰리가 기숙사 방에 꾸며 놓은 트리 아래에서 잤다고 웃고, 선물 상자에서 커플 스웨터를 꺼내 타일러의 스케이트 날을 닦는다. 날에 걸린 털실이 줄줄 풀려 나가고, 타일러는 주장 여자 친구가 털실이나 들고 다녀 창피했다며 상자를 바닥에 던진다.</w:t>
       </w:r>
     </w:p>
     <w:p>
@@ -2033,7 +2033,7 @@
           <w:b w:val="0"/>
           <w:sz w:val="21"/>
         </w:rPr>
-        <w:t>몰리는 상자를 그대로 두고 경기장 뒤 야외 링크로 나가, 울지 않고 남은 퍽을 하나씩 펜스에 후려친다. 그 소리에 혼자 스케이트를 타던 체이스가 다가와 이유를 묻자, 자책골이 자기 때문이었다는 걸 모르는 몰리가 쏘아붙인다. 「나 크리스마스 양말이래. 안 뜯어 봐도 뻔한 선물.」 체이스는 그 양말은 자기가 받고 싶다고 능청을 떨더니, 스틱을 건네고 골문 앞에 서서 자기 얼굴을 타일러라고 생각하고 쏴 보라고 한다. 몰리가 힘껏 후려친 퍽은 골대를 맞고 튕겨 나와 몰리의 이마를 때린다. 몰리가 얼음 위로 쓰러지고, 체이스가 장갑을 내던지며 달려온다.</w:t>
+        <w:t>몰리는 상자를 그대로 두고 경기장 뒤 야외 링크로 나가, 울지 않고 남은 퍽을 하나씩 펜스에 후려친다. 그 소리에 혼자 스케이트를 타던 체이스가 다가와 이유를 묻자, 몰리가 쏘아붙인다. 「남친이 나랑 자는 게 재미없대. 크리스마스 양말처럼 뻔하대.」 체이스는 그런 양말이면 자기가 받고 싶다고 능청을 떨더니, 스틱을 건네고 골문 앞에 서서 자기 얼굴을 타일러라고 생각하고 쏴 보라고 한다. 몰리가 힘껏 후려친 퍽은 골대를 맞고 튕겨 나와 몰리의 이마를 때린다. 몰리가 얼음 위로 쓰러지고, 체이스가 장갑을 내던지며 달려온다.</w:t>
       </w:r>
     </w:p>
     <w:p>
@@ -2062,7 +2062,7 @@
           <w:b w:val="0"/>
           <w:sz w:val="21"/>
         </w:rPr>
-        <w:t>몰리가 눈을 뜬 곳은 체이스의 아파트 소파다. 이마에는 언 완두콩 봉지가 얹혀 있고, 몸에는 램스 담요가 덮여 있다. 체이스는 몰리가 잠꼬대로 자기 이름은 두 번 부르고 타일러 이름은 한 번도 안 불렀다고 놀린다. 몰리는 거짓말 말라며, 작년 홀리데이 시리즈 때 체이스가 관중석으로 날린 퍽에 자기 렌즈가 깨진 걸 아직 안 잊었다고 쏘아붙인다. 체이스는 그때도 몰리 렌즈가 타일러만 따라다녀서 그랬다고 웃지만, 몰리는 그 말을 농담으로만 듣는다.</w:t>
+        <w:t>몰리가 눈을 뜬 곳은 체이스의 아파트 소파다. 이마에는 언 완두콩 봉지가 얹혀 있고, 몸에는 램스 담요가 덮여 있다. 체이스는 몰리가 잠꼬대로 체이스 이름은 두 번 부르고 타일러 이름은 한 번도 안 불렀다고 놀린다. 몰리는 거짓말 말라며, 작년 홀리데이 시리즈 때 체이스가 관중석으로 날린 퍽에 자기 렌즈가 깨진 걸 아직 안 잊었다고 쏘아붙인다. 체이스는 몰리 렌즈가 타일러만 따라다니는 게 보기 싫어서 그랬다고 웃지만, 몰리는 그 말을 농담으로만 듣는다.</w:t>
       </w:r>
     </w:p>
     <w:p>
@@ -2076,7 +2076,7 @@
           <w:b w:val="0"/>
           <w:sz w:val="21"/>
         </w:rPr>
-        <w:t>완두콩 봉지를 내려놓은 몰리는, 타일러 말대로 자기가 정말 뜯어 볼 것도 없는 여자면 어떡하냐고 묻는다. 체이스는 대답 대신 타일러에게 똑같이 망신을 돌려주자고 한다. 체이스도 크리스마스이브 결승 날 타일러가 퍽 대신 몰리 생각만 하게 만들고 싶다. 어쩌자는 거냐는 몰리에게 체이스가 몸을 기울인다. 「나랑 자자. 크리스마스이브까지.」</w:t>
+        <w:t>완두콩 봉지를 내려놓은 몰리는, 타일러 말대로 자기가 정말 침대에서 재미없는 여자면 어떡하냐고 묻는다. 체이스는 대답 대신 타일러에게 똑같이 망신을 돌려주자고 한다. 체이스도 크리스마스이브 결승 날 타일러가 퍽 대신 몰리 생각만 하게 만들고 싶다. 어쩌자는 거냐는 몰리에게 체이스가 몸을 기울인다. 「나랑 자자. 크리스마스이브까지.」</w:t>
       </w:r>
     </w:p>
     <w:p>
@@ -2148,7 +2148,7 @@
           <w:b w:val="0"/>
           <w:sz w:val="21"/>
         </w:rPr>
-        <w:t>타일러 얼굴이 굳자, 체이스는 쿠키를 씹으며 몰리가 밤새 한 장만 더 찍자고 해서 한숨도 못 잤다고 거든다. 이어 체이스는 몰리가 꾸민 트리 아래에서 바람피운 놈이 사진 한 장에 열을 내느냐고 묻는다. 타일러는 브리트니를 끌어안고, 자기는 양말 대신 진짜 선물을 받았을 뿐이라고 받아친다. 몰리가 맞춰 달라고 속삭이자, 체이스는 복도가 다 들리게 워밍업 전 30분 동안 램스 라커룸이 비니 어젯밤 못 끝낸 걸 마저 하자고 답한다. 타일러는 바닥에 떨어진 17번 쿠키를 운동화로 짓밟고 돌아선다.</w:t>
+        <w:t>타일러 얼굴이 굳자, 체이스는 쿠키를 씹으며 몰리가 밤새 한 장만 더 찍자고 해서 한숨도 못 잤다고 거든다. 이어 체이스는 몰리가 꾸민 트리 아래에서 바람피운 놈이 사진 한 장에 열을 내느냐고 묻는다. 타일러는 브리트니를 끌어안고, 자기는 뻔한 양말 대신 진짜 선물로 갈아탄 것뿐이라고 받아친다. 몰리가 타일러를 더 약 올리자고 속삭이자, 체이스는 복도가 다 들리게 워밍업 전 30분 동안 램스 라커룸이 비니 어젯밤 못 끝낸 걸 마저 하자고 답한다. 타일러는 바닥에 떨어진 17번 쿠키를 운동화로 짓밟고 돌아선다.</w:t>
       </w:r>
     </w:p>
     <w:p>
@@ -2162,7 +2162,7 @@
           <w:b w:val="0"/>
           <w:sz w:val="21"/>
         </w:rPr>
-        <w:t>텅 빈 램스 라커룸에서 몰리는 타일러가 정말 올지 걱정하지만, 체이스는 쿠키를 짓밟고 간 놈이 안 올 리 없다고 한다. 연습 삼아 먼저 입을 맞춘 몰리가 숨을 꾹 참은 채 굳어 있자, 체이스는 사진 찍히는 사람처럼 굳지 말라고 웃는다. 몰리가 타일러 말이 맞았나 보다며 고개를 숙이자, 체이스는 몰리의 카메라를 벤치에 세우고 10초 타이머를 누른 뒤 몰리 허리를 끌어당긴다. 「찰칵 소리 날 때까지 떨어지지 마.」</w:t>
+        <w:t>텅 빈 램스 라커룸에서 몰리는 타일러가 정말 올지 걱정하지만, 체이스는 쿠키를 짓밟고 간 놈이 안 올 리 없다고 한다. 연습 삼아 먼저 입을 맞춘 몰리가 숨을 꾹 참은 채 굳어 있자, 체이스는 사진 찍히는 사람처럼 굳지 말라고 웃는다. 몰리가 자기는 정말 재미없는 여자인가 보다며 고개를 숙이자, 체이스는 몰리의 카메라를 벤치에 세우고 10초 타이머를 누른 뒤 몰리 허리를 끌어당긴다. 「찰칵 소리 날 때까지 떨어지지 마.」</w:t>
       </w:r>
     </w:p>
     <w:p>
@@ -2205,7 +2205,7 @@
           <w:b w:val="0"/>
           <w:sz w:val="21"/>
         </w:rPr>
-        <w:t>복도까지 따라온 진행자가 크리스마스 한철 노는 상대냐고 묻자, 체이스가 마이크를 붙잡는다. 「한철 아니고 진짜 사귀는 사이예요. 크리스마스이브에 우승컵 들면, 그 사진은 이 사람이 찍습니다.」 그 장면이 경기장 전광판에 뜨는 동안, 관중석의 몰리는 그 산타 모자를 눌러쓴 채 그 말도 연기라고 믿는다. 베어스 벤치에서 맨머리가 된 타일러가 중얼거린다. 「저 여자, 2년 동안 내 사진만 찍던 여자야.」</w:t>
+        <w:t>복도까지 따라온 진행자가 크리스마스 한철 노는 상대냐고 묻자, 체이스가 마이크를 붙잡는다. 「한철 아니고 진짜 사귀는 사이예요. 크리스마스이브에 우승컵 들면, 그 사진은 이 사람이 찍습니다.」 경기가 시작되고 그 인터뷰가 경기장 전광판에 뜨는 동안, 관중석의 몰리는 그 산타 모자를 눌러쓴 채 그 말도 연기라고 믿는다. 베어스 벤치에서 맨머리가 된 타일러가 중얼거린다. 「2년 동안 내 사진만 찍던 여자가, 저놈 사진을 찍겠다고?」</w:t>
       </w:r>
     </w:p>
     <w:p>
@@ -2234,7 +2234,7 @@
           <w:b w:val="0"/>
           <w:sz w:val="21"/>
         </w:rPr>
-        <w:t>관중석 앞줄 사람들이 돌아앉아 산타 모자를 쓴 몰리를 찍고, 늘 찍기만 하던 몰리가 처음으로 찍히는 쪽이 된다. 빙판 위에서 타일러가 남의 여자 갖고 노니 재밌냐며 체이스를 밀치자, 체이스가 받아친다. 「네가 양말이라던 거, 난 아직 다 뜯지도 못했어.」 타일러가 주먹을 날리다 퇴장당하고, 주장을 잃은 베어스가 두 번째 경기를 내줘 우승컵은 크리스마스이브 마지막 경기로 넘어간다. 경기가 끝나자 전광판 키스캠이 겨우살이 테두리 안에 몰리와 체이스를 띄운다. 체이스는 타일러가 보고 있다고 속삭이며 입을 맞추고, 몰리는 필요한 것보다 3초 더 떨어지지 않는다.</w:t>
+        <w:t>관중석 앞줄 사람들이 돌아앉아 산타 모자를 쓴 몰리를 찍고, 늘 찍기만 하던 몰리가 처음으로 찍히는 쪽이 된다. 빙판 위에서 타일러가 남의 여자 갖고 노니 재밌냐며 체이스를 밀치자, 체이스가 받아친다. 「뻔하다며? 난 밤새 지루할 틈이 없던데.」 타일러가 주먹을 날리다 퇴장당하고, 주장을 잃은 베어스가 두 번째 경기를 내줘 우승컵은 크리스마스이브 마지막 경기로 넘어간다. 경기가 끝나자 전광판 키스캠이 겨우살이 테두리 안에 몰리와 체이스를 띄운다. 체이스는 타일러가 보고 있다고 속삭이며 입을 맞추고, 몰리는 연기에 필요한 것보다 3초 더 떨어지지 않는다.</w:t>
       </w:r>
     </w:p>
     <w:p>
@@ -2320,7 +2320,7 @@
           <w:b w:val="0"/>
           <w:sz w:val="21"/>
         </w:rPr>
-        <w:t>브리트니는 체이스가 크리스마스라고 불쌍한 여자 하나 거둬 준 것뿐이라며 비웃는다. 몰리가 받아친다. 「버린 거 주워 쓰는 건 네 특기잖아. 타일러처럼.」 램스 선수들이 환호하자 타일러가 맥주잔을 들고 끼어들어, 몰리는 침대에서 눈사람처럼 꼼짝도 안 하고 차갑기만 하다고 파티장이 다 들리게 떠벌린다. 몰리가 쥔 컵이 찌그러지는 순간, 체이스가 먼저 입을 연다. 「눈사람? 난 어젯밤에 한겨울인데 창문 열고 잤어.」 체이스는 몰리가 차가웠다면 문제는 타일러 쪽 아니냐고 되묻는다. 타일러가 체이스의 멱살을 잡자, 체이스는 그 손을 털어 내고 몰리를 어깨에 들쳐 멘 채 2층 방으로 올라간다.</w:t>
+        <w:t>브리트니는 체이스가 크리스마스라고 불쌍한 여자 하나 거둬 준 것뿐이라며 비웃는다. 몰리가 받아친다. 「버린 거 주워 쓰는 건 네 특기잖아. 내가 버린 타일러처럼.」 램스 선수들이 환호하자 타일러가 맥주잔을 들고 끼어들어, 몰리는 침대에서 눈사람처럼 꼼짝도 안 하고 차갑기만 하다고 파티장이 다 들리게 떠벌린다. 몰리가 쥔 컵이 찌그러지는 순간, 체이스가 먼저 입을 연다. 「눈사람? 난 어젯밤에 너무 더워서 한겨울에 창문 열고 잤는데.」 체이스는 몰리가 차가웠다면 문제는 타일러 쪽 아니냐고 되묻는다. 타일러가 체이스의 멱살을 잡자, 체이스는 그 손을 털어 내고 몰리를 어깨에 들쳐 멘 채 2층 방으로 올라간다.</w:t>
       </w:r>
     </w:p>
     <w:p>
@@ -2847,7 +2847,7 @@
           <w:b w:val="0"/>
           <w:sz w:val="21"/>
         </w:rPr>
-        <w:t>다음 날 2차전 미디어 데이, 해나의 카메라를 목에 건 애슐리가 닉 옆에 선 해나를 보고, 사진은 카메라가 다 찍어 주더라며 비웃는다. 닉이 애슐리의 목에서 카메라를 벗겨 해나에게 걸어 준다. 「자기야, 네 이름 새긴 카메라가 왜 남의 목에 걸려 있어?」 데릭은 해나가 외박하려면 오빠들 허락부터 받는 애라며, 어젯밤 받은 침대 사진에 속을 줄 아냐고 비웃는다. 대답 대신 해나는 사인용 마커를 집어 닉의 셔츠를 걷어 올리고, 그 배 위에 자기 이름을 쓴다.</w:t>
+        <w:t>다음 날 2차전 미디어 데이, 해나의 카메라를 목에 건 애슐리가 닉 옆에 선 해나를 보고, 사진 같은 건 카메라만 있으면 누구나 찍는다며 비웃는다. 닉이 애슐리의 목에서 카메라를 벗겨 해나에게 걸어 준다. 「자기야, 네 이름 새긴 카메라가 왜 남의 목에 걸려 있어?」 데릭은 해나가 외박하려면 오빠들 허락부터 받는 애라며, 어젯밤 받은 침대 사진에 속을 줄 아냐고 비웃는다. 대답 대신 해나는 사인용 마커를 집어 닉의 셔츠를 걷어 올리고, 그 배 위에 자기 이름을 쓴다.</w:t>
       </w:r>
     </w:p>
     <w:p>
@@ -2876,7 +2876,7 @@
           <w:b w:val="0"/>
           <w:sz w:val="21"/>
         </w:rPr>
-        <w:t>해나가 이름을 다 쓰기도 전에 오빠 셋이 몰려온다. 카일은 적 팀 주장 배에 사인해 주는 게 무슨 동생이냐고 소리치고, 조시는 해나를 배신자라고 부른다. 닉은 애슐리가 데릭과 오빠들 집 소파를 쓸 땐 열쇠까지 줬으면서 친동생은 사인 하나도 안 되냐고 오빠들에게 묻는다. 데릭은 가져가라며, 어차피 연습용이었다고 비웃는다. 해나는 마커 뚜껑을 닫으며 모두에게 들리게 말한다. 「반쪽만 썼네. 나머지는 라커룸에서 마저 쓸게.」 데릭은 욕을 뱉고 돌아선다.</w:t>
+        <w:t>해나가 이름을 다 쓰기도 전에 오빠 셋이 몰려온다. 카일은 적 팀 주장 배에 사인해 주는 게 무슨 동생이냐고 소리치고, 조시는 해나를 배신자라고 부른다. 닉은 애슐리가 데릭과 오빠들 집 소파를 쓸 땐 열쇠까지 줬으면서 친동생은 사인 하나도 안 되냐고 오빠들에게 묻는다. 데릭은 가져가라며, 해나는 어차피 연습용 여자였다고 비웃는다. 해나는 마커 뚜껑을 닫으며 모두에게 들리게 말한다. 「반쪽만 썼네. 나머지는 라커룸에서 마저 쓸게.」 데릭은 욕을 뱉고 돌아선다.</w:t>
       </w:r>
     </w:p>
     <w:p>
@@ -3048,7 +3048,7 @@
           <w:b w:val="0"/>
           <w:sz w:val="21"/>
         </w:rPr>
-        <w:t>손님들이 사진과 해나를 번갈아 보자, 해나가 애슐리 앞으로 걸어간다. 「적어도 난 오빠들 소파에 청바지 벗어 두고 다니진 않았어.」 손님들이 환호하자, 데릭이 끼어들어 해나는 침대에서도 내내 나 잘하고 있냐고만 묻는다고 떠벌린다. 카일과 조시는 웃음을 터뜨리고, 라이언만 웃지 않는다. 해나의 손안에서 종이컵이 구겨진다. 닉이 고개를 갸웃한다. 「이상하네. 나한텐 한 번도 안 묻던데. 물어볼 틈을 안 줘서 그런가.」 데릭이 닉의 멱살을 잡으려는 순간, 닉은 해나를 어깨에 들쳐 메고 라이언의 방으로 들어가 문을 잠근다.</w:t>
+        <w:t>손님들이 사진과 해나를 번갈아 보자, 해나가 애슐리 앞으로 걸어간다. 「적어도 난 남의 남친이랑 오빠들 소파에서 바지 벗진 않았어.」 손님들이 환호하자, 데릭이 끼어들어 해나는 침대에서도 내내 나 잘하고 있냐고만 묻는다고 떠벌린다. 카일과 조시는 웃음을 터뜨리고, 라이언만 웃지 않는다. 해나의 손안에서 종이컵이 구겨진다. 닉이 고개를 갸웃한다. 「이상하네. 나한텐 한 번도 안 묻던데. 물어볼 필요가 없었나 보지.」 데릭이 닉의 멱살을 잡으려는 순간, 닉은 해나를 어깨에 들쳐 메고 라이언의 방으로 들어가 문을 잠근다.</w:t>
       </w:r>
     </w:p>
     <w:p>
@@ -3447,7 +3447,7 @@
           <w:b w:val="0"/>
           <w:sz w:val="21"/>
         </w:rPr>
-        <w:t>인간 손이 왕족 살에 닿으면 사형이라는 외침에도, 에밀리는 강보를 젖혀 테오 발가락을 감은 은빛 머리카락을 풀어낸다. 보랏빛 발가락에서 피가 터지는 순간, 석 달 만에 돌아온 엘프 왕 에이드리언의 칼끝이 에밀리 목에 닿는다. 「그 손 떼라. 손목까지 두고 가기 싫으면.」 에밀리는 오히려 에이드리언 손을 끌어다 테오 발에 얹는다. 「베는 건 이따가요. 지금은 여기 꾹 눌러요.」</w:t>
+        <w:t>인간 손이 왕족 살에 닿으면 사형이라는 외침에도, 에밀리는 강보를 젖혀 테오 발가락을 감은 은빛 머리카락을 풀어낸다. 보랏빛 발가락에서 피가 터지는 순간, 석 달 만에 돌아온 엘프 왕 에이드리언의 칼끝이 에밀리 목에 닿는다. 「그 손 떼라. 손목 잘리기 싫으면.」 에밀리는 오히려 에이드리언 손을 끌어다 테오 발에 얹는다. 「베는 건 이따가요. 지금은 여기 꾹 눌러요.」</w:t>
       </w:r>
     </w:p>
     <w:p>
@@ -3476,7 +3476,7 @@
           <w:b w:val="0"/>
           <w:sz w:val="21"/>
         </w:rPr>
-        <w:t>에이드리언이 피가 멎으면 목부터 치겠다며 칼을 세우자, 테오 주먹에서 가시덩굴이 터져 칼날을 밀어낸다. 「내 거야! 형 칼 치워!」 경비대장이 인간의 자작극이라고 몰자, 에밀리는 그 머리카락을 들어 올린다. 에밀리 키보다 긴 은빛 머리는 궁에 하나, 300년째 보모장인 아그네스의 것이다. 대비는 아그네스를 꾸짖으면서도 하루살이 운은 하루면 끝난다고 잘라 말한다.</w:t>
+        <w:t>에이드리언이 피가 멎으면 목부터 치겠다며 칼을 세우자, 테오 주먹에서 가시덩굴이 터져 칼날을 밀어낸다. 「내 거야! 형 칼 치워!」 경비대장이 인간의 자작극이라고 몰자, 에밀리는 그 머리카락을 들어 올린다. 에밀리 키보다 긴 은빛 머리는 궁에 하나, 300년째 보모장인 아그네스의 것이다. 대비는 아그네스를 꾸짖으면서도 인간의 운은 하루면 끝난다고 잘라 말한다.</w:t>
       </w:r>
     </w:p>
     <w:p>
@@ -3490,7 +3490,7 @@
           <w:b w:val="0"/>
           <w:sz w:val="21"/>
         </w:rPr>
-        <w:t>에이드리언이 테오를 안자 테오가 또 자지러진다. 「형 얼굴에 누가 낙서했어!」 에밀리가 얼굴부터 씻으라고 하자 경비대장은 왕의 전쟁 맹세라며 펄쩍 뛰지만, 에이드리언은 테오 목욕물에 얼굴을 담근다. 테오가 형 품에서 울음을 그치자, 에밀리는 사형당할 뻔한 값을 달라며 손을 내민다. 인간 주제에 값을 부르느냐는 말에는, 하루살이라 오늘 받아야 한다고 받아친다. 에이드리언은 해 지기 전 테오가 젖병을 비우면 보물 창고 두 손 가득, 못 비우면 에밀리는 가시 우물, 아그네스는 숲 밖이라고 건다. 테오가 먹으면 배에 풍선이 생긴다며 젖병을 밀어내자, 에밀리가 아그네스를 돌아본다. 「얘, 열 달 동안 트림은 해 봤어요?」</w:t>
+        <w:t>에이드리언이 테오를 안자 테오가 또 자지러진다. 「형 얼굴에 누가 낙서했어!」 에밀리가 얼굴부터 씻으라고 하자 경비대장은 왕이 얼굴에 그린 전쟁 문양이라며 펄쩍 뛰지만, 에이드리언은 테오 목욕물에 얼굴을 담근다. 테오가 형 품에서 울음을 그치자, 에밀리는 사형당할 뻔한 값을 달라며 손을 내민다. 인간 주제에 값을 부르느냐는 말에는, 하루살이라 오늘 받아야 한다고 받아친다. 에이드리언은 해 지기 전 테오가 젖병을 비우면 보물 창고 두 손 가득, 못 비우면 에밀리는 가시 우물에 던지고 아그네스는 왕궁에서 쫓아내겠다고 건다. 테오가 젖병을 밀어내는 사이, 에밀리 귀에만 먹으면 배에 풍선이 생긴다는 테오 목소리가 들린다. 에밀리가 아그네스를 돌아본다. 「얘, 열 달 동안 트림은 해 봤어요?」</w:t>
       </w:r>
     </w:p>
     <w:p>
@@ -3533,7 +3533,7 @@
           <w:b w:val="0"/>
           <w:sz w:val="21"/>
         </w:rPr>
-        <w:t>가시가 박혔는데 왜 안 놓았냐는 에이드리언에게 에밀리가 답한다. 「바닥이 돌이잖아요. 어깨 구멍값은 따로 받을게요.」 아그네스가 모레 세계수에 테오 이름을 새기는 의식에 인간이 왕자를 안으면 웃음거리라고 막아서자, 에이드리언은 300년 보모장이 열 달 동안 못 시킨 트림을 이 인간은 하루 만에 시켰다고 말을 자른다. 가시 없이 재우면 두 손 가득을 한 번 더 준다는 말에, 에밀리가 테오를 안아 든다. 「밤 근무는 두 배예요. 이번엔 자루로 주세요.」</w:t>
+        <w:t>가시가 박혔는데 왜 안 놓았냐는 에이드리언에게 에밀리가 답한다. 「놓으면 돌바닥에 떨어지잖아요. 어깨 구멍값은 따로 받을게요.」 아그네스가 모레 세계수에 테오 이름을 새기는 의식에 인간이 왕자를 안으면 웃음거리라고 막아서자, 에이드리언은 300년 보모장이 열 달 동안 못 시킨 트림을 이 인간은 하루 만에 시켰다고 말을 자른다. 에이드리언이 가시 없이 재우면 보물 두 손 가득을 한 번 더 주겠다고 하자, 에밀리가 테오를 안아 든다. 「밤 근무는 두 배예요. 이번엔 자루로 주세요.」</w:t>
       </w:r>
     </w:p>
     <w:p>
@@ -3562,7 +3562,7 @@
           <w:b w:val="0"/>
           <w:sz w:val="21"/>
         </w:rPr>
-        <w:t>그날 밤 테오는 눈을 부릅뜨고 잠을 버틴다. 「형은 '곧 올게' 하고 백 밤 있다 와. 그래서 안 자.」 아그네스가 늘 하던 이름 노래로 재우려 하자, 테오는 그 노래가 무섭다며 더 크게 운다. 에밀리는 아그네스까지 내보내고, 장로 회의에 가려던 에이드리언을 붙잡는다. 「엘프한테 '곧'은 몇 년이죠? 애한테 '곧'은 내일 아침이에요.」</w:t>
+        <w:t>그날 밤 테오는 눈을 부릅뜨고 잠을 버틴다. 「형은 '곧 올게' 하고 백 밤 있다 와. 그래서 안 자.」 아그네스가 엘프 아기를 재울 때 부르는, 테오 이름을 길게 늘여 부르는 노래를 시작하자, 테오는 그 노래가 무섭다며 더 크게 운다. 에밀리는 아그네스까지 내보내고, 장로 회의에 가려던 에이드리언을 붙잡는다. 「엘프한테 '곧'은 몇 년이죠? 애한테 '곧'은 내일 아침이에요.」</w:t>
       </w:r>
     </w:p>
     <w:p>
@@ -3676,7 +3676,7 @@
           <w:b w:val="0"/>
           <w:sz w:val="21"/>
         </w:rPr>
-        <w:t>에밀리가 테오를 팔뚝에 엎어 등을 네 번 두드려도 도토리는 나오지 않고, 테오 목소리는 형을 찾으며 작아진다. 에이드리언이 테오 손을 잡고 곧 꺼내 주겠다고 하자 에밀리가 소리친다. 「또 '곧'이에요? 지금 여기 있다고 해요!」 에이드리언이 무릎을 꿇는다. 「형 여기 있어. 아무 데도 안 가.」 에밀리의 다섯 번째 손바닥에 도토리가 튀어나오고, 바닥을 뚫고 솟은 세계수 뿌리가 테오를 안은 에밀리를 통째로 감는다. 뿌리에 감기면 엘프 왕도 나무가 된다는 걸 아는 에이드리언이 칼이 부러지도록 내리친다. 「에밀리, 내 허락 없이 죽으면 그것도 사형이다.」</w:t>
+        <w:t>에밀리가 테오를 팔뚝에 엎어 등을 네 번 두드려도 도토리는 나오지 않고, 테오 목소리는 형을 찾으며 작아진다. 에이드리언이 테오 손을 잡고 곧 꺼내 주겠다고 하자 에밀리가 소리친다. 「또 '곧'이에요? 지금 여기 있다고 해요!」 에이드리언이 무릎을 꿇는다. 「형 여기 있어. 아무 데도 안 가.」 에밀리가 다섯 번째로 등을 내려치자 도토리가 튀어나오고, 성물 도토리가 바닥에 닿는 순간 바닥을 뚫고 솟은 세계수 뿌리가 테오를 안은 에밀리를 통째로 감는다. 뿌리에 감기면 엘프 왕도 나무가 된다는 걸 아는 에이드리언이 칼이 부러지도록 내리친다. 「에밀리, 내 허락 없이 죽으면 그것도 사형이다.」</w:t>
       </w:r>
     </w:p>
     <w:p>
@@ -4090,7 +4090,7 @@
           <w:b w:val="0"/>
           <w:sz w:val="21"/>
         </w:rPr>
-        <w:t>경비 칼이 케이티 왼손목에 닿는 순간, 올리 꼬리가 케이티 오른손목을 칭칭 감고, 꼬리를 떼려던 경비 장갑이 하얗게 얼어붙는다. 마거릿은 인간 손이 닿아서 왕자 비늘이 데었다고 소리치지만, 그 순간 마거릿 앞치마 주머니에서 달군 돌 하나가 굴러떨어진다. 아기 용은 따뜻하게 품어야 한다는 옛 법대로 마거릿이 밤마다 데워 넣던 돌이다.</w:t>
+        <w:t>경비 칼이 케이티 왼손목에 닿는 순간, 올리 꼬리가 케이티 오른손목을 칭칭 감고, 꼬리를 떼려던 경비 장갑이 하얗게 얼어붙는다. 마거릿은 인간 손이 닿아서 왕자 비늘이 데었다고 소리치지만, 그 순간 마거릿 앞치마 주머니에서 달군 돌 하나가 굴러떨어진다. 아기 용은 따뜻하게 품어야 한다는 옛 법을 얼음 용 아기에게도 그대로 지켜, 마거릿이 밤마다 데워 넣던 돌이다.</w:t>
       </w:r>
     </w:p>
     <w:p>
@@ -4104,7 +4104,7 @@
           <w:b w:val="0"/>
           <w:sz w:val="21"/>
         </w:rPr>
-        <w:t>헨리가 요람에 다가서자 올리가 또 자지러진다. 「형 화나면 천장에서 칼 떨어져.」 케이티가 올려다보니, 헨리가 얼굴을 찌푸릴 때마다 요람 위에 고드름이 자란다. 케이티가 웃으라고 시키자 헨리는 굳은 얼굴로 이만 드러내고, 고드름이 멈추자 형 품에 안긴 올리가 처음으로 울음을 그친다. 방세 마흔 닢은 받아야겠다는 케이티에게 헨리가 왕궁 일에 값을 묻는 자는 없다고 하자, 케이티가 받아친다. 「그러니까 석 달 동안 아무도 못 달랬죠.」 헨리는 내일 동지 연회까지 올리가 먹고 자면 자기 보물 더미에서 두 손 가득 퍼 가게 하고, 못 하면 그 손목을 받겠다고 한다. 케이티가 왕실 젖병을 물리려 하자 올리가 고개를 돌린다. 「또 바다 맛이야.」</w:t>
+        <w:t>헨리가 요람에 다가서자 올리가 또 자지러진다. 「형 화나면 천장에서 칼 떨어져.」 케이티가 올려다보니, 헨리가 얼굴을 찌푸릴 때마다 요람 위에 고드름이 자란다. 케이티가 웃으라고 시키자 헨리는 굳은 얼굴로 이만 드러내고, 고드름이 멈추자 형 품에 안긴 올리가 처음으로 울음을 그친다. 방세 마흔 닢은 받아야겠다는 케이티에게 헨리가 왕궁 일에 값을 묻는 자는 없다고 하자, 케이티가 받아친다. 「공짜로 일한 사람들이 석 달 동안 못 달랜 애예요. 전 돈 받고 제대로 해요.」 헨리는 내일 동지 연회까지 올리가 먹고 자면 자기 보물 더미에서 두 손 가득 퍼 가게 하고, 못 하면 그 손목을 받겠다고 한다. 케이티가 왕실 젖병을 물리려 하자 올리가 고개를 돌린다. 「또 짠 바다 맛이야.」</w:t>
       </w:r>
     </w:p>
     <w:p>
@@ -4147,7 +4147,7 @@
           <w:b w:val="0"/>
           <w:sz w:val="21"/>
         </w:rPr>
-        <w:t>케이티가 짠 젖에 부푼 올리 배를 문지르자, 아파서 몸부림치던 올리가 서리를 뿜어 요람이 통째로 얼고 서리가 케이티 팔꿈치까지 타고 오른다. 케이티가 끝까지 손을 떼지 않자 올리는 짠 젖을 다 게워 내고, 케이티가 품에 넣어 데운 순록 젖을 끝까지 비운다. 케이티는 언 소매를 털며 팔 동상 은화 열 닢, 터진 소매 두 닢 하고 치료비를 세다가, 올리가 언 손가락을 꼭 쥐자 셈을 잊는다. 헨리는 그걸 본다. 마거릿이 인간은 얼음 연회장에서 한 시간도 못 버틴다고 막아서자, 헨리는 자기 털장갑을 벗어 케이티 언 손에 끼워 준다. 「내일 올리 옆자리는 이 손이다.」 케이티가 올리에게 속삭인다. 「우리 동업하자. 넌 푹 자고, 난 보물 퍼 가고.」</w:t>
+        <w:t>케이티가 짠 젖에 부푼 올리 배를 문지르자, 아파서 몸부림치던 올리가 서리를 뿜어 요람이 통째로 얼고 서리가 케이티 팔꿈치까지 타고 오른다. 케이티가 끝까지 손을 떼지 않자 올리는 짠 젖을 다 게워 내고, 케이티가 품에 넣어 데운 순록 젖을 끝까지 비운다. 케이티는 언 소매를 털며 팔 동상 은화 열 닢, 터진 소매 두 닢 하고 치료비를 세다가, 올리가 언 손가락을 꼭 쥐자 셈을 잊는다. 헨리는 그걸 본다. 마거릿이 인간은 얼음 연회장에서 한 시간도 못 버틴다고 막아서자, 헨리는 자기 털장갑을 벗어 케이티 언 손에 끼워 준다. 「내일 연회에서 올리 옆자리는 이 여자다.」 케이티가 올리에게 속삭인다. 「우리 동업하자. 넌 푹 자고, 난 보물 퍼 가고.」</w:t>
       </w:r>
     </w:p>
     <w:p>
@@ -4176,7 +4176,7 @@
           <w:b w:val="0"/>
           <w:sz w:val="21"/>
         </w:rPr>
-        <w:t>하지만 그날 밤 올리는 자기는커녕, 케이티 손의 형 장갑을 빼내 형 망토 단추와 깃펜이 쌓인 이불 밑에 숨긴다. 「형 거 다 여기 있어. 그럼 형이 가지러 와.」 밤마다 용이 되어 국경 얼음벽을 얼리러 날아가는 형이, 물건을 찾으러라도 돌아오길 바란 것이다. 오늘도 날아가려던 헨리를 막아선 케이티는, 용은 보물 더미 위에서 자니 오늘은 형이 보물 더미가 되라며 헨리를 바닥에 눕힌다. 형 가슴이 딱딱하다고 올리가 칭얼대자, 케이티는 숨을 천천히 쉬라고 시키고 헨리는 그 숨을 군대 구령처럼 하나, 둘 센다. 웃다 잠들던 올리가 웅얼거린다. 「인간은 하나도 안 반짝여. 그래도 내 보물 할래.」 케이티가 받아친다. 「고마운데, 방금 나 싸구려라고 했지.」</w:t>
+        <w:t>하지만 그날 밤 올리는 자기는커녕, 케이티 손의 형 장갑을 빼내 형 망토 단추와 깃펜이 쌓인 이불 밑에 숨긴다. 「형 거 다 여기 있어. 그럼 형이 가지러 와.」 밤마다 용이 되어 국경 얼음벽을 얼리러 날아가는 형이, 물건을 찾으러라도 돌아오길 바란 것이다. 오늘도 날아가려던 헨리를 막아선 케이티는, 용은 보물 더미 위에서 자니 오늘은 형이 보물 더미가 되라며, 헨리를 바닥에 눕히고 그 가슴 위에 올리를 올린다. 형 가슴이 딱딱하다고 올리가 칭얼대자, 케이티는 숨을 천천히 쉬라고 시키고 헨리는 그 숨을 군대 구령처럼 하나, 둘 센다. 웃다 잠들던 올리가 웅얼거린다. 「인간은 하나도 안 반짝여. 그래도 내 보물 할래.」 케이티가 받아친다. 「고마운데, 방금 나 싸구려라고 했지.」</w:t>
       </w:r>
     </w:p>
     <w:p>
@@ -4219,7 +4219,7 @@
           <w:b w:val="0"/>
           <w:sz w:val="21"/>
         </w:rPr>
-        <w:t>밤새 울렸다는 그 얼음 북이, 한 해 가장 긴 밤인 동지 연회장 한가운데 놓여 있다. 용 영주들은 인간 손목이 연회 끝까지 붙어 있을지를 두고 은화 내기를 건다. 케이티가 북부터 치우자고 하자 영주들은 해를 부르는 북을 안 치면 봄이 안 온다고 비웃지만, 헨리는 북채마다 털가죽을 감으라고 명령한다.</w:t>
+        <w:t>밤새 울렸다는 그 얼음 북이, 한 해 가장 긴 밤인 동지 연회장 한가운데 놓여 있다. 용 영주들은 인간 손목이 연회 끝까지 붙어 있을지를 두고 은화 내기를 건다. 케이티가 북부터 치우자고 하자 영주들은 해를 부르는 북을 안 치면 봄이 안 온다고 비웃지만, 헨리는 북소리가 작게 나도록 북채마다 털가죽을 감으라고 명령한다.</w:t>
       </w:r>
     </w:p>
     <w:p>
@@ -4233,7 +4233,7 @@
           <w:b w:val="0"/>
           <w:sz w:val="21"/>
         </w:rPr>
-        <w:t>다음은 아기 용 앞에 보물 쟁반을 놓고, 처음 쥔 보물을 평생 지키게 하는 첫 보물 고르기다. 헨리가 자기 왕 반지를 쟁반에 올리자 케이티는 뭐든 숨기는 아기라며 쟁반을 치우라고 하고, 영주들은 용은 보물을 지키지 삼키지 않는다고 화를 낸다. 케이티가 받아친다. 「어젯밤엔 형 장갑을 이불 밑에 숨겼어요. 오늘은 어디 숨길 것 같아요?」 그 사이 케이티에게만 올리 속마음이 들린다. 「형 반지. 배 속에 넣으면 아무도 못 뺏어.」 올리가 반지를 삼키고, 케이티가 달려들어 안았을 때 올리 입술은 파랗고 가슴은 움직이지 않는다. 유모장 열쇠를 넘겨주게 생긴 마거릿이 케이티를 가리킨다. 「제가 봤어요. 저 인간이 쟁반을 왕자님 앞으로 밀었어요.」</w:t>
+        <w:t>다음은 아기 용 앞에 보물 쟁반을 놓고, 처음 쥔 보물을 평생 지키게 하는 첫 보물 고르기다. 헨리가 자기 왕 반지를 쟁반에 올리자 케이티는 뭐든 숨기는 아기라며 쟁반을 치우라고 하고, 영주들은 용은 보물을 지키지 삼키지 않는다고 화를 낸다. 케이티가 받아친다. 「어젯밤엔 형 장갑을 이불 밑에 숨긴 애예요. 반지는 입에 넣어 숨길 거라고요.」 그 사이 케이티에게만 올리 속마음이 들린다. 「형 반지. 배 속에 넣으면 아무도 못 뺏어.」 올리가 반지를 삼키고, 케이티가 달려들어 안았을 때 올리 입술은 파랗고 가슴은 움직이지 않는다. 유모장 열쇠를 넘겨주게 생긴 마거릿이 케이티를 가리킨다. 「제가 봤어요. 저 인간이 쟁반을 왕자님 앞으로 밀었어요.」</w:t>
       </w:r>
     </w:p>
     <w:p>
@@ -4572,7 +4572,7 @@
           <w:b w:val="0"/>
           <w:sz w:val="21"/>
         </w:rPr>
-        <w:t>2. 염색한 가짜를 구원자로 믿고 진짜 반려를 짓밟는 남자, 버림받은 반려의 후회물 정석</w:t>
+        <w:t>2. 염색한 가짜를 구원자로 믿고 진짜 반려를 짓밟다가 그 반려에게 먼저 버림받는 왕자, 뒤늦은 후회물의 정석</w:t>
       </w:r>
     </w:p>
     <w:p>
@@ -4647,7 +4647,7 @@
           <w:b w:val="0"/>
           <w:sz w:val="21"/>
         </w:rPr>
-        <w:t>공작 저택 절벽 테라스. 둘째 딸 제나가 난간 위에서, 눈이 멀었다는 다크 엘프 왕에게 시집가느니 뛰어내리겠다고 울부짖는다. 계모 다이앤은 딸을 붙들고 남편 공작을 몰아세운다. 이 집에 딸이 제나 하나뿐이냐고. 그때 맏딸 올리비아가 덩굴을 타고 공중에서 내려선다. 타고난 백금발을 계모 손에 검게 물들인 채 '재앙의 흑발'이라 손가락질받으며 자란 딸이다. 「죽고 싶어? 그럼 죽어.」 올리비아의 덩굴이 제나를 휘감아 절벽 아래로 내던진다. 공작이 다급히 정령 바람을 날려, 바위에 부딪히기 직전의 제나를 겨우 끌어 올린다. 어떻게 동생한테 이럴 수 있냐는 다이앤의 비명에 올리비아가 받아친다. 「엄마 살아 있을 때부터 아버지 첩이던 여자 딸이, 무슨 내 동생이야.」 그리고 아버지를 돌아본다. 「쟤가 죽어도 싫다는 그 혼인, 내가 갈게요. 대신 계모가 숨겨 둔 엄마 유품부터 내놓으세요.」</w:t>
+        <w:t>공작 저택 절벽 테라스. 둘째 딸 제나가 난간 위에서, 눈이 멀었다는 다크 엘프 왕에게 시집가느니 뛰어내리겠다고 울부짖는다. 계모 다이앤은 딸을 붙들고 남편 공작을 몰아세운다. 이 집에 딸이 제나 하나뿐이냐고. 그때 맏딸 올리비아가 덩굴을 타고 공중에서 내려선다. 타고난 백금발을 계모 손에 검게 물들인 채 '재앙의 흑발'이라 손가락질받으며 자란 딸이다. 「죽고 싶어? 그럼 죽어.」 올리비아의 덩굴이 제나를 휘감아 절벽 아래로 내던진다. 공작이 다급히 정령 바람을 날려, 바위에 부딪히기 직전의 제나를 겨우 끌어 올린다. 어떻게 동생한테 이럴 수 있냐는 다이앤의 비명에 올리비아가 받아친다. 「엄마 살아 있을 때부터 아버지 첩이던 여자 딸이, 무슨 내 동생이야.」 그리고 아버지를 돌아본다. 「쟤가 죽어도 싫다는 그 결혼, 내가 할게요. 대신 계모가 숨겨 둔 엄마의 정령수 병부터 내놓으세요.」</w:t>
       </w:r>
     </w:p>
     <w:p>
@@ -4661,7 +4661,7 @@
           <w:b w:val="0"/>
           <w:sz w:val="21"/>
         </w:rPr>
-        <w:t>올리비아가 이 집을 떠나기로 한 건 어젯밤 때문이다. 3년 전, 어린 날 자기를 살린 백금발 소녀를 찾던 엘프 왕자 데미안이 공작가 호위를 자청했고, 올리비아가 그를 골랐다. 손이 닿자 둘의 손바닥에 영혼의 반려에게만 피는 붉은 덩굴이 떠올랐지만, 데미안은 흑발 여자가 그 소녀일 리 없다며 장갑으로 덮었다. 그 소녀가 올리비아라는 걸 그는 모른다. 3년 동안 매일 아침 손끝으로 정령 꽃을 피워 그녀 머리에 꽂아 주던 그를, 올리비아는 사랑했다. 그리고 어젯밤 두 영혼을 잇는 결속 의식, 붉은 덩굴이 두 사람을 감아 오르던 순간 데미안이 입술을 대려다 다른 여자의 이름을 불렀다. 「제나.」 덩굴이 시들어 바스러졌다.</w:t>
+        <w:t>올리비아가 이 집을 떠나기로 한 건 어젯밤 때문이다. 3년 전, 어린 날 자기를 살린 백금발 소녀를 찾던 엘프 왕자 데미안이 공작가 호위를 자청했고, 올리비아가 그를 자기 호위로 골랐다. 손이 닿자 둘의 손바닥에 영혼의 반려에게만 피는 붉은 덩굴이 떠올랐지만, 데미안은 흑발 여자가 그 소녀일 리 없다며 자기 손바닥의 덩굴을 장갑으로 덮었다. 그 소녀가 올리비아라는 걸 그는 모른다. 3년 동안 매일 아침 손끝으로 정령 꽃을 피워 그녀 머리에 꽂아 주던 그를, 올리비아는 사랑했다. 그리고 어젯밤 두 영혼을 잇는 결속 의식, 붉은 덩굴이 두 사람을 감아 오르던 순간 데미안이 올리비아에게 입을 맞추려다 다른 여자의 이름을 불렀다. 「제나.」 덩굴이 시들어 바스러졌다.</w:t>
       </w:r>
     </w:p>
     <w:p>
@@ -4690,7 +4690,7 @@
           <w:b w:val="0"/>
           <w:sz w:val="21"/>
         </w:rPr>
-        <w:t>다음 날 아침 왕궁 연회장. 올리비아는 모두가 보는 앞에서 데미안의 손을 잡아 장갑을 벗긴다. 3년 동안 숨겨 온 붉은 덩굴이 드러나자 연회장이 술렁이고, 올리비아는 그 앞에서 단검으로 자기 손바닥의 덩굴을 그어 찢는다. 「너 같은 반려는 필요 없어. 내가 먼저 버린다.」 피가 떨어지는 손으로 아버지 앞에 선 올리비아는, 제나 대신 다크 엘프 왕국의 왕비가 되겠다고 선언한다. 귀족들은 재앙의 흑발에겐 눈먼 왕이 딱이라며 비웃고, 제나는 데미안 품에 파고들어 언니가 자기를 죽이려 했다고 운다. 제나를 감싸 안은 데미안은, 버림받은 쪽이 자기라는 게 믿기지 않는 얼굴로 올리비아를 본다. 「어디 가나 보자. 일주일도 못 버티고 돌아올 테니.」</w:t>
+        <w:t>다음 날 아침, 혼약을 알리려 귀족들이 모인 공작 저택 연회장. 올리비아는 모두가 보는 앞에서 데미안의 손을 잡아 장갑을 벗긴다. 3년 동안 숨겨 온 붉은 덩굴이 드러나자 연회장이 술렁이고, 올리비아는 그 앞에서 단검으로 자기 손바닥의 덩굴을 그어 찢는다. 「너 같은 반려는 필요 없어. 내가 먼저 버린다.」 피가 떨어지는 손으로 아버지 앞에 선 올리비아는, 제나 대신 다크 엘프 왕국의 왕비가 되겠다고 선언한다. 귀족들은 재앙의 흑발에겐 눈먼 왕이 딱이라며 비웃고, 제나는 데미안 품에 파고들어 언니가 자기를 죽이려 했다고 운다. 제나를 감싸 안은 데미안은, 버림받은 쪽이 자기라는 게 믿기지 않는 얼굴로 올리비아를 본다. 「어디 가나 보자. 일주일도 못 버티고 돌아올 테니.」</w:t>
       </w:r>
     </w:p>
     <w:p>
@@ -4719,7 +4719,7 @@
           <w:b w:val="0"/>
           <w:sz w:val="21"/>
         </w:rPr>
-        <w:t>그날 밤 데미안은 영원히 꺼지지 않는 정령 보석을 손에 쥐고 있다. 제나의 생일에 줄 선물이다. 보석의 빛을 보며 그는 어린 날 숲을 떠올린다. 독화살에 쓰러진 그에게 달려온 백금발 소녀가 입으로 독을 빨아내 주었고, 데미안은 그 소녀가 제나라고 믿는다. 그 소녀가 올리비아였고, 어머니가 죽은 뒤 계모가 그 백금발을 검게 물들였으며, 올리비아가 물을 씻어 낼 때마다 공작이 계모 말만 듣고 딸을 때렸다는 걸 그는 모른다. 다음 날 마구간, 올리비아는 다크 엘프 왕국까지 타고 갈 흰 말의 갈기에 혼례 리본을 땋는다. 따라온 데미안이 갈 생각도 없으면서 자기 마음을 끌려고 쇼한다고 비웃자, 올리비아는 그를 보지도 않고 마지막 리본을 꽉 묶는다. 「착각하지 마. 다음 달이면 나, 다크 엘프 왕국 왕비야.」</w:t>
+        <w:t>그날 밤 데미안은 영원히 꺼지지 않는 정령 보석을 손에 쥐고 있다. 제나의 생일에 줄 선물이다. 보석의 빛을 보며 그는 어린 날 숲을 떠올린다. 독화살에 쓰러진 그에게 달려온 백금발 소녀가 입으로 독을 빨아내 주었다. 지금 공작가에서 백금발은 제나뿐이라, 데미안은 그 소녀가 제나라고 믿는다. 그 소녀는 올리비아였다. 어머니가 죽은 뒤 계모는 올리비아의 백금발을 검게, 자기 딸 제나의 머리는 백금발로 물들였고, 올리비아가 검은 물을 씻어 낼 때마다 공작은 계모 말만 듣고 딸을 때렸다. 데미안은 그걸 모른다. 다음 날 마구간, 올리비아는 다크 엘프 왕국까지 타고 갈 흰 말의 갈기에 혼례 리본을 땋는다. 따라온 데미안이 갈 생각도 없으면서 자기 마음을 끌려고 쇼한다고 비웃자, 올리비아는 그를 보지도 않고 마지막 리본을 꽉 묶는다. 「착각하지 마. 다음 달이면 나, 다크 엘프 왕국 왕비야.」</w:t>
       </w:r>
     </w:p>
     <w:p>
@@ -4748,7 +4748,7 @@
           <w:b w:val="0"/>
           <w:sz w:val="21"/>
         </w:rPr>
-        <w:t>데미안의 얼굴이 굳는 사이, 제나가 마구간으로 들어온다. 제나는 흰 말의 갈기를 쓰다듬으며, 눈먼 왕은 말 색도 못 볼 테니 이 말은 백금발인 자기가 타야 어울린다고 조른다. 데미안은 망설임 없이 올리비아 손에서 고삐를 빼앗아 제나에게 쥐여 준다. 구경하러 몰려든 하인과 귀족들 앞에서, 제나는 그 고삐를 올리비아 발밑에 던진다. 「언니가 끌어. 마부처럼.」 사람들이 킥킥대는 가운데, 올리비아는 천천히 고삐를 주워 데미안의 가슴팍에 던진다. 「네가 끌어. 3년 동안 내 머리에 꽃 꽂아 주던 손이잖아.」 왕자가 마부 취급을 당하자 웃음이 터진다. 얼굴이 새빨개진 제나는 손끝에 불의 정령을 불러내 마른 짚더미에 내던진다.</w:t>
+        <w:t>데미안의 얼굴이 굳는 사이, 제나가 마구간으로 들어온다. 제나는 흰 말의 갈기를 쓰다듬으며, 눈먼 왕은 말 색도 못 볼 테니 이 말은 백금발인 자기가 타야 어울린다고 조른다. 데미안은 망설임 없이 올리비아 손에서 고삐를 빼앗아 제나에게 쥐여 준다. 구경하러 몰려든 하인과 귀족들 앞에서, 제나는 그 고삐를 올리비아 발밑에 던진다. 「내가 탈 테니까 언니가 끌어. 마부처럼.」 사람들이 킥킥대는 가운데, 올리비아는 천천히 고삐를 주워 데미안의 가슴팍에 던진다. 「끌고 싶으면 네가 끌어. 제나 마부는 너잖아.」 왕자가 마부 취급을 당하자 웃음이 터진다. 얼굴이 새빨개진 제나는 손끝에 불의 정령을 불러내 마른 짚더미에 내던진다.</w:t>
       </w:r>
     </w:p>
     <w:p>
@@ -4806,7 +4806,7 @@
           <w:b w:val="0"/>
           <w:sz w:val="21"/>
         </w:rPr>
-        <w:t>혼자 남은 올리비아에게 자객들의 칼이 쏟아진다. 팔이 베이고 뺨이 갈라져도 올리비아는 깔린 다리를 빼내 단검 하나로 버티지만, 끝내 피투성이로 쓰러진다. 마지막 칼날이 목을 향해 내려오는 순간, 올리비아의 몸에서 은빛 정령력이 터져 자객들을 날려 버리고 불길까지 한꺼번에 삼킨다. 그을린 머리끝 한 가닥이 백금빛으로 번뜩인다. 그 빛을 보고 돌아온 데미안이 무릎을 꿇지만, 올리비아는 눈을 감는다. 「이미 골랐잖아. 이제 와서 걱정하는 척하지 마.」 그때 녹아 흘러내린 염색약을 망토로 가린 제나가 긁힌 팔을 내밀며 언니 때문에 다쳤다고 울고, 데미안은 또다시 제나를 안아 든다. 같은 시각, 엘프 가운데 가장 강하다는 흑발의 다크 엘프 왕 가브리엘이 신부가 피투성이가 됐다는 보고를 받는다. 그가 늘 두르던 검은 눈가리개를 풀자, 멀었다던 두 눈이 멀쩡하게 빛난다. 「말 준비해. 내 왕비는 내가 데려온다.」</w:t>
+        <w:t>혼자 남은 올리비아에게 자객들의 칼이 쏟아진다. 팔이 베이고 뺨이 갈라져도 올리비아는 깔린 다리를 빼내 단검 하나로 버티지만, 끝내 피투성이로 쓰러진다. 마지막 칼날이 목을 향해 내려오는 순간, 올리비아의 몸에서 은빛 정령력이 터져 자객들을 날려 버리고 불길까지 한꺼번에 삼킨다. 불에 그을려 검은 물이 벗겨진 머리끝 한 가닥이 백금빛으로 번뜩인다. 그 빛을 보고 돌아온 데미안이 올리비아 곁에 무릎을 꿇지만, 올리비아는 눈을 감는다. 「이미 골랐잖아. 이제 와서 걱정하는 척하지 마.」 그때 불길에 백금빛 염색이 녹아 흘러내린 머리를 망토로 가린 제나가 긁힌 팔을 내밀며 언니 때문에 다쳤다고 울고, 데미안은 또다시 제나를 안아 든다. 같은 시각, 엘프 가운데 가장 강하다는 흑발의 다크 엘프 왕 가브리엘이 신부가 피투성이가 됐다는 보고를 받는다. 그가 늘 두르던 검은 눈가리개를 풀자, 멀었다던 두 눈이 멀쩡하게 빛난다. 「말 준비해. 내 왕비는 내가 데려온다.」</w:t>
       </w:r>
     </w:p>
     <w:p>
@@ -4835,7 +4835,7 @@
           <w:b w:val="0"/>
           <w:sz w:val="21"/>
         </w:rPr>
-        <w:t>사흘 뒤 제나의 생일 연회. 뺨에 칼자국이 남은 채 다리를 절며 들어선 올리비아를, 하객들은 마구간에 불을 지른 범인이라며 손가락질한다. 데미안은 그 앞에서 꺼지지 않는 정령 보석을 제나 목에 걸어 주고, 하객들은 진짜 구원자에게 어울리는 선물이라며 손뼉을 친다. 그때 제나가 작은 유리병을 꺼내 흔든다. 올리비아가 혼인 값으로 겨우 돌려받아 혼례 짐에 넣어 둔, 어머니가 마지막 숨으로 채워 남긴 정령수다. 올리비아가 돌려 달라며 다가서자 데미안이 앞을 막는다. 제나에게 사과하고, 불의 정령이 갇힌 수정 구슬을 맨손으로 감싸 쥔 채 불이 다 꺼질 때까지 버티면 돌려주겠다는 것이다. 제나가 웃으며 이글거리는 구슬을 내민다. 「언니, 이거 들고 끝까지 서 있어 봐.」</w:t>
+        <w:t>사흘 뒤 제나의 생일 연회. 뺨에 칼자국이 남은 채 다리를 절며 들어선 올리비아를, 하객들은 마구간에 불을 지른 범인이라며 손가락질한다. 데미안은 그 앞에서 꺼지지 않는 정령 보석을 제나 목에 걸어 주고, 하객들은 왕자님 마음을 얻은 건 역시 제나라며 손뼉을 친다. 그때 제나가 작은 유리병을 꺼내 흔든다. 어머니가 죽기 전 마지막 정령력을 담아 남긴 정령수 병, 올리비아가 결혼을 받아들인 대가로 겨우 돌려받아 혼례 짐에 넣어 둔 바로 그 병이다. 올리비아가 돌려 달라며 다가서자 데미안이 앞을 막는다. 마구간에 불을 지른 걸 제나에게 사과하고, 불의 정령이 갇힌 수정 구슬을 맨손으로 감싸 쥔 채 불이 다 꺼질 때까지 버티면 돌려주겠다는 것이다. 제나가 웃으며 이글거리는 구슬을 내민다. 「언니, 이거 들고 끝까지 서 있어 봐.」</w:t>
       </w:r>
     </w:p>
     <w:p>
@@ -4864,7 +4864,7 @@
           <w:b w:val="0"/>
           <w:sz w:val="21"/>
         </w:rPr>
-        <w:t>올리비아는 데미안을 똑바로 보며 구슬을 받아 든다. 「사과는 안 해. 대신 이건 불 꺼질 때까지 들고 있을게.」 구슬 속 불의 정령이 깨어나 시뻘겋게 달아오르고, 올리비아의 손바닥이 타들어 간다. 그런데 이를 악물고 비틀거리는 건 데미안이다. 찢어도 다 지워지지 않은 덩굴 때문에, 올리비아의 손이 타는 고통이 장갑 속 데미안의 손바닥으로 그대로 건너온 것이다. 데미안은 주먹을 쥐고 버티고, 올리비아는 눈 하나 깜빡하지 않는다. 마침내 불이 꺼지자 올리비아는 새까맣게 탄 손으로 구슬을 내려놓는다. 「끝까지 들었어. 이제 엄마 거 돌려줘.」 올리비아가 어머니의 병으로 손을 뻗는 순간, 제나가 한발 먼저 병을 낚아챈다.</w:t>
+        <w:t>올리비아는 데미안을 똑바로 보며 구슬을 받아 든다. 「불 지른 건 내가 아니니까 사과는 안 해. 대신 이건 불 꺼질 때까지 들고 있을게.」 구슬 속 불의 정령이 깨어나 시뻘겋게 달아오르고, 올리비아의 손바닥이 타들어 간다. 그런데 이를 악물고 비틀거리는 건 데미안이다. 올리비아가 찢었어도 둘의 손바닥에 아직 남아 있는 반려의 덩굴 때문에, 올리비아의 손이 타는 고통이 장갑 속 데미안의 손바닥으로 그대로 건너온 것이다. 데미안은 주먹을 쥐고 버티고, 올리비아는 눈 하나 깜빡하지 않는다. 마침내 불이 꺼지자 올리비아는 새까맣게 탄 손으로 구슬을 내려놓는다. 「끝까지 들었어. 이제 엄마 거 돌려줘.」 올리비아가 어머니의 병으로 손을 뻗는 순간, 제나가 한발 먼저 병을 낚아챈다.</w:t>
       </w:r>
     </w:p>
     <w:p>
@@ -4893,7 +4893,7 @@
           <w:b w:val="0"/>
           <w:sz w:val="21"/>
         </w:rPr>
-        <w:t>제나는 검게 물든 머리로 엄마 물 따위를 가져서 뭐 하냐며, 병을 바닥에 내리쳐 깨뜨린다. 흩어진 정령수가 마지막 빛을 내다 꺼지는 걸 본 순간, 참아 왔던 올리비아의 분노가 터진다. 올리비아는 제나의 머리채를 잡아 바닥에 처박는다. 데미안이 달려들어 장갑 낀 손으로 올리비아의 목을 움켜쥐고 떼어 낸다. 숨이 막혀 얼굴이 하얗게 질리면서도, 올리비아는 그를 노려본다. 「잘 기억해. 지금 네가 목 조르는 여자가, 그날 숲에서 네 목숨 살린 그 아이야.」 데미안의 손이 멈칫하는 순간, 연회장 문이 부서지며 한 남자가 들어선다. 그는 데미안의 팔을 꺾어 떼어 내고, 쓰러지는 올리비아를 품에 안는다. 눈이 멀었다던 다크 엘프 왕 가브리엘이 데미안을 내려다본다. 「감히 누구 신부를 건드려! 절대 가만두지 않겠다!」</w:t>
+        <w:t>제나는 재앙의 흑발 주제에 엄마 물 따위가 무슨 소용이냐며, 병을 바닥에 내리쳐 깨뜨린다. 흩어진 정령수가 마지막 빛을 내다 꺼지는 걸 본 순간, 참아 왔던 올리비아의 분노가 터진다. 올리비아는 제나의 머리채를 잡아 바닥에 처박는다. 데미안이 달려들어 장갑 낀 손으로 올리비아의 목을 움켜쥐고 떼어 낸다. 숨이 막혀 얼굴이 하얗게 질리면서도, 올리비아는 그를 노려본다. 「잘 기억해. 지금 네가 목 조르는 여자가, 그날 숲에서 네 목숨 살린 그 아이야.」 데미안의 손이 멈칫하는 순간, 연회장 문이 부서지며 한 남자가 들어선다. 그는 데미안의 팔을 꺾어 떼어 내고, 쓰러지는 올리비아를 품에 안는다. 눈이 멀었다던 다크 엘프 왕 가브리엘이 데미안을 내려다본다. 「감히 누구 신부를 건드려! 절대 가만두지 않겠다!」</w:t>
       </w:r>
     </w:p>
     <w:p>
@@ -5278,7 +5278,7 @@
           <w:b w:val="0"/>
           <w:sz w:val="21"/>
         </w:rPr>
-        <w:t>그레이스가 꿇으라고 해도 로건은 움직이지 않는다. 그레이스는 순식간에 로건의 허리에서 단검을 뽑고 무릎 뒤를 걷어차 꿇린 뒤, 칼끝을 목에 댄 채 턱을 들어 올린다. 「자기 칼도 못 지키는 놈이 날 지켜? 좋아, 너로 할게.」 그 손끝이 닿는 순간 두 사람 손목에 메이트 표식이 떠오른다. 로건은 소매로 표식을 덮으며 자기가 찾는 소녀는 앰버라고 되뇐다. 그 망토의 원래 주인이 그레이스라는 걸 로건은 모른다.</w:t>
+        <w:t>그레이스가 꿇으라고 해도 로건은 움직이지 않는다. 그레이스는 순식간에 로건의 허리에서 단검을 뽑고 무릎 뒤를 걷어차 꿇린 뒤, 칼끝을 목에 댄 채 턱을 들어 올린다. 「자기 칼도 못 지키는 놈이 날 지켜? 좋아, 너로 할게.」 그레이스의 손끝이 로건의 턱에 닿는 순간, 두 사람 손목에 메이트 표식이 떠오른다. 로건은 소매로 표식을 덮으며 자기가 찾는 소녀는 앰버라고 되뇐다. 앰버가 어릴 적 두르던 그 빨간 망토의 원래 주인이 그레이스라는 걸 로건은 모른다.</w:t>
       </w:r>
     </w:p>
     <w:p>
@@ -5378,7 +5378,7 @@
           <w:b w:val="0"/>
           <w:sz w:val="21"/>
         </w:rPr>
-        <w:t>다음 날 그레이스는 혼례 짐을 사러 장터까지 호위하라고 하지만, 새 망토를 두른 앰버가 말 앞을 막아서자 로건은 앰버를 태우고 먼저 떠난다. 빨간 망토를 두른 그레이스가 눈길을 혼자 걸어 장터에 닿았을 때, 로건은 2년 동안 그레이스에게 해 주던 그 손길로 앰버의 망토 끈을 매 주고 있다. 그때 토머스가 보낸 전령이 장터 한가운데서 외친다. 「스톤리지의 첫째 공주 그레이스, 보름 뒤 섀도우밸리의 알렉산더와 혼인한다!」</w:t>
+        <w:t>다음 날 그레이스는 혼례 짐을 사러 장터까지 호위하라고 하지만, 새 망토를 두른 앰버가 말 앞을 막아서자 로건은 앰버를 태우고 먼저 떠난다. 빨간 망토를 두른 그레이스가 눈길을 혼자 걸어 장터에 닿았을 때, 로건은 2년 동안 아침마다 그레이스의 드레스 끈을 묶어 주던 그 손으로 앰버의 망토 끈을 매 주고 있다. 그때 토머스가 보낸 전령이 장터 한가운데서 외친다. 「스톤리지의 첫째 공주 그레이스, 보름 뒤 섀도우밸리의 알렉산더와 혼인한다!」</w:t>
       </w:r>
     </w:p>
     <w:p>
@@ -5464,7 +5464,7 @@
           <w:b w:val="0"/>
           <w:sz w:val="21"/>
         </w:rPr>
-        <w:t>로건이 알파의 목소리로 망토를 불에 넣으라고 명령하자, 장터의 늑대들이 그 목소리에 눌려 모두 무릎을 꿇는다. 늑대가 없는 그레이스만 꼿꼿이 서서 로건을 본다. 「명령은 늑대한테나 해. 나는 들을 늑대가 없거든.」 그레이스는 앰버의 어깨에서 새 빨간 망토를 끌어내려 화로에 던져 넣고 장터를 나선다.</w:t>
+        <w:t>로건이 알파의 목소리로 망토를 불에 넣으라고 명령하자, 장터의 늑대들이 그 목소리에 눌려 모두 무릎을 꿇는다. 늑대가 없는 그레이스에게만 알파의 목소리가 먹히지 않는다. 혼자 꼿꼿이 선 그레이스가 로건을 본다. 「알파 명령은 늑대한테나 먹혀. 나는 늑대가 없거든.」 그레이스는 앰버의 어깨에서 새 빨간 망토를 끌어내려 화로에 던져 넣고 장터를 나선다.</w:t>
       </w:r>
     </w:p>
     <w:p>
@@ -5593,7 +5593,7 @@
           <w:b w:val="0"/>
           <w:sz w:val="21"/>
         </w:rPr>
-        <w:t>토머스는 동생을 물에 빠뜨린 벌로는 가볍다고 하고, 린다는 앰버의 손을 잡고 웃는다. 그레이스가 로건을 똑바로 본다. 「거짓말은 안 해. 대신 물엔 들어갈게. 이 노래가 끝날 때까지.」 그레이스는 오르골 태엽을 직접 감아 열어 두고, 맨발로 얼음 연못을 깨고 들어간다.</w:t>
+        <w:t>토머스는 동생을 물에 빠뜨린 벌로는 가볍다고 하고, 린다는 앰버의 손을 잡고 웃는다. 그레이스가 로건을 똑바로 본다. 「앰버를 빠뜨렸다는 거짓말은 안 해. 대신 물엔 들어갈게. 이 노래가 끝날 때까지.」 그레이스는 오르골 태엽을 직접 감아 열어 두고, 맨발로 얼음 연못을 깨고 들어간다.</w:t>
       </w:r>
     </w:p>
     <w:p>
@@ -5607,7 +5607,7 @@
           <w:b w:val="0"/>
           <w:sz w:val="21"/>
         </w:rPr>
-        <w:t>엄마가 그레이스에게만 불러 주던 노래가 연회장까지 울리자 하객들의 웃음이 멎는다. 토머스는 죽은 아내의 노래인 걸 알면서도 끝까지 말리지 않는다. 그 노래에 로건의 손에서 잔이 멈춘다. 덫 앞에서 빨간 망토 소녀가 흥얼거리던 바로 그 노래다. 노래가 끝나고 입술이 파래진 그레이스가 물에서 걸어 나와 오르골로 손을 뻗는 순간, 앰버가 먼저 오르골을 낚아채 그레이스의 귀에만 들리게 속삭인다. 「이 노래, 나도 다 외웠어. 그러니까 이건 이제 없어도 돼.」</w:t>
+        <w:t>엄마가 그레이스에게만 불러 주던 노래가 연회장까지 울리자 하객들의 웃음이 멎는다. 토머스는 죽은 아내의 노래인 걸 알면서도 끝까지 말리지 않는다. 그 노래에 로건의 손에서 잔이 멈춘다. 덫 앞에서 빨간 망토 소녀가 흥얼거리던 바로 그 노래다. 노래가 끝나고 입술이 파래진 그레이스가 물에서 걸어 나와 오르골로 손을 뻗는 순간, 앰버가 먼저 오르골을 낚아채 그레이스의 귀에만 들리게 속삭인다. 「이 노래, 나도 다 외웠어. 이제 로건 앞에서 이 노래 부를 사람은 나야.」</w:t>
       </w:r>
     </w:p>
     <w:p>
@@ -5650,7 +5650,7 @@
           <w:b w:val="0"/>
           <w:sz w:val="21"/>
         </w:rPr>
-        <w:t>그레이스가 앰버에게 달려들자, 로건이 메이트 표식이 남은 손으로 그레이스의 목을 움켜쥐고 앰버에게서 떼어 낸다. 목이 졸린 그레이스가 로건을 본다. 「그날 네 목에서 칼을 떼는 게 아니었어.」 그 순간 연회장 문이 부서지고, 목에 발톱 흉터가 난 남자가 로건의 손목을 꺾어 떼어 내며 쓰러지는 그레이스를 품에 안는다. 늑대를 잃었다던 섀도우밸리의 알파 알렉산더가 로건을 내려다본다. 「감히 내 루나를 건드려? 오늘 여기서 살아 나갈 생각 마라!」</w:t>
+        <w:t>그레이스가 앰버에게 달려들자, 로건이 메이트 표식이 남은 손으로 그레이스의 목을 움켜쥐고 앰버에게서 떼어 낸다. 목이 졸린 그레이스가 로건을 본다. 「처음 만난 날 네 목에 댄 칼, 그때 그었어야 했어.」 그 순간 연회장 문이 부서지고, 목에 발톱 흉터가 난 남자가 로건의 손목을 꺾어 떼어 내며 쓰러지는 그레이스를 품에 안는다. 늑대를 잃었다던 섀도우밸리의 알파 알렉산더가 로건을 내려다본다. 「감히 내 루나를 건드려? 오늘 여기서 살아 나갈 생각 마라!」</w:t>
       </w:r>
     </w:p>
     <w:p>
@@ -6021,7 +6021,7 @@
           <w:b w:val="0"/>
           <w:sz w:val="21"/>
         </w:rPr>
-        <w:t>아버지 프랭크와 오빠 브록의 노름빚 대신, 일흔 살 노름판 주인의 일곱째 아내로 팔린 열아홉 살 애나. 신부 썰매에 묶여 언 호수를 건너던 밤, 애나는 밧줄을 이로 끊고 얼음 위로 뛰어내린다. 김이 오르는 얼음 구멍으로 달려가니, 물속에 용의 피를 잇는 왕가의 왕세자 대니얼이 앉아 있다. 겨울마다 가슴 속 용의 불이 숨을 막는 불기침을 앓는 대니얼은, 밤마다 몰래 궁을 나와 얼음물에 몸을 식힌다. 왕세자의 병을 아무도 알아선 안 된다는 국왕의 명 때문에, 대니얼은 살려 달라는 애나를 두고 두건을 눌러쓴다.</w:t>
+        <w:t>아버지 프랭크와 오빠 브록의 노름빚 대신, 일흔 살 노름판 주인의 일곱째 아내로 팔린 열아홉 살 애나. 신부 썰매에 묶여 언 호수를 건너던 밤, 애나는 밧줄을 이로 끊고 얼음 위로 뛰어내린다. 김이 오르는 얼음 구멍 쪽으로 달려가 보니, 얼음물 속에 한 남자가 몸을 담그고 있다. 용의 피를 잇는 왕가의 왕세자 대니얼이다. 겨울마다 가슴 속 용의 불이 숨을 막는 불기침을 앓는 대니얼은, 밤마다 몰래 궁을 나와 얼음물에 몸을 식힌다. 왕세자의 병을 아무도 알아선 안 된다는 국왕의 명 때문에, 대니얼은 살려 달라는 애나를 외면하고 두건을 눌러써 얼굴을 가린다.</w:t>
       </w:r>
     </w:p>
     <w:p>
@@ -6035,7 +6035,7 @@
           <w:b w:val="0"/>
           <w:sz w:val="21"/>
         </w:rPr>
-        <w:t>쫓아온 프랭크와 브록이 애나의 머리채를 잡자, 애나는 빚 대신 딸을 파는 아비가 어디 있느냐고 울부짖는다. 그 소리에 대니얼이 얼음에 맨손을 대자, 두 사람 발밑 얼음이 녹아 갈라지고 둘은 허우적대다 달아난다. 얇은 신부 옷만 입은 애나가 파랗게 얼어 쓰러지자, 대니얼은 애나를 불 없는 낚시 오두막으로 안고 들어간다. 어두워서 애나는 자기를 안은 남자의 얼굴도, 그가 왕세자라는 것도 모르고, 그 몸이 뜨겁다는 것만 안다. 「얼어 죽느니, 당신한테 데는 게 나아요.」</w:t>
+        <w:t>쫓아온 프랭크와 브록이 애나의 머리채를 잡자, 애나는 빚 대신 딸을 파는 아비가 어디 있느냐고 울부짖는다. 그 소리에 대니얼이 얼음에 맨손을 대자, 프랭크와 브록의 발밑 얼음이 녹아 갈라지고, 둘은 허우적대다 달아난다. 얇은 신부 옷만 입은 애나가 파랗게 얼어 쓰러지자, 대니얼은 애나를 불 없는 낚시 오두막으로 안고 들어간다. 어두워서 애나는 자기를 안은 남자의 얼굴도, 그가 왕세자라는 것도 모르고, 그 몸이 뜨겁다는 것만 안다. 「얼어 죽느니, 당신한테 데는 게 나아요.」</w:t>
       </w:r>
     </w:p>
     <w:p>
@@ -6064,7 +6064,7 @@
           <w:b w:val="0"/>
           <w:sz w:val="21"/>
         </w:rPr>
-        <w:t>6년 뒤 겨울 시장, 숯을 파는 애나는 다섯 살 아들 샘의 불기침 약값을 깨진 항아리에 한 닢씩 모은다. 굴뚝 청소를 마친 샘은 검댕투성이 얼굴로 동전 세 닢을 내밀며, 이걸로 신전 용 불꽃에 초를 바쳐 아빠가 오게 해 달라고 빌 거라고 한다. 샘의 목에는 가운데가 뚫린 은화 한 닢이 끈에 꿰여 있다. 6년 전 그 새벽 남자는 사라지고, 남자의 뜨거운 손가락이 녹여 구멍을 낸 은화 한 닢만 남아 있었다. 애나는 이 구멍을 보면 아빠가 샘을 알아볼 거라고 말해 왔지만, 그 남자가 왕세자 대니얼이라는 건 애나도 샘도 모른다.</w:t>
+        <w:t>6년 뒤 겨울 시장, 숯을 파는 애나는 다섯 살 아들 샘의 불기침 약값을 깨진 항아리에 한 닢씩 모은다. 굴뚝 청소를 마친 샘은 검댕투성이 얼굴로 동전 세 닢을 내밀며, 이걸로 신전 용 불꽃에 초를 바쳐 아빠가 오게 해 달라고 빌 거라고 한다. 샘의 목에는 가운데가 뚫린 은화 한 닢이 끈에 꿰여 있다. 6년 전 그 새벽, 남자는 뜨거운 손가락으로 은화 한 닢에 구멍을 뚫어 애나 손에 쥐여 주고 사라졌다. 애나는 이 구멍을 보면 아빠가 샘을 알아볼 거라고 말해 왔지만, 그 남자가 왕세자 대니얼이라는 건 애나도 샘도 모른다.</w:t>
       </w:r>
     </w:p>
     <w:p>
@@ -6121,7 +6121,7 @@
           <w:b w:val="0"/>
           <w:sz w:val="21"/>
         </w:rPr>
-        <w:t>프랭크와 브록이 달아나자, 애나는 아이가 신전 소원을 너무 믿어서 그렇다며 샘을 끌어당긴다. 대니얼이 애나의 언 손을 잡아 일으키자, 애나는 그 손의 열이 낯익고 대니얼은 그 차가운 손을 놓지 못한다. 두 사람 다 6년 전 얼음 호수의 상대가 서로인 줄 모른다. 결혼하라는 국왕에게 숨겨 둔 아들이 있다고 둘러댄 대니얼은, 가장 긴 밤 잔치에 그 아들을 데려가기로 약속한 참이다. 「잔치가 끝날 때까지 샘은 내 아들로, 당신은 샘의 엄마로 궁에 들어와 주시오.」</w:t>
+        <w:t>프랭크와 브록이 달아나자, 애나는 아이가 신전 소원을 너무 믿어서 그렇다며 샘을 끌어당긴다. 대니얼이 애나의 언 손을 잡아 일으키자, 애나는 그 손의 열이 낯익고 대니얼은 그 차가운 손을 놓지 못한다. 두 사람 다 6년 전 얼음 호수의 상대가 서로인 줄 모른다. 결혼하라는 국왕에게 숨겨 둔 아들이 있다고 둘러댄 대니얼은, 한 해 가장 긴 밤에 여는 왕실 잔치에 그 아들을 데려가기로 약속한 참이다. 「잔치가 끝날 때까지 샘은 내 아들로, 당신은 샘의 엄마로 궁에 들어와 주시오.」</w:t>
       </w:r>
     </w:p>
     <w:p>
@@ -6150,7 +6150,7 @@
           <w:b w:val="0"/>
           <w:sz w:val="21"/>
         </w:rPr>
-        <w:t>애나가 대답을 못 하자, 샘은 저 사람 손이 엄청 따뜻하다며, 우리 집엔 팔 숯만 있고 땔 숯은 없지 않냐고 애나의 소매를 당긴다. 샘이 어른이 될 때까지 얼음꽃 알약을 대 주겠다는 대니얼의 말에 애나는 손을 내민다. 궁으로 가는 길에 가짜 아들 연습을 하던 샘은 묻지도 않은 말을 지어낸다. 「아빠는 밤마다 엄마 발을 녹여 줘요.」 애나는 사레가 들리고 대니얼은 귀까지 빨개진다. 두 사람 다 6년 전 얼음 호수의 밤을 떠올리지만, 그 밤의 상대가 서로라는 건 모른다.</w:t>
+        <w:t>애나가 대답을 못 하자, 샘은 저 아저씨 손이 엄청 따뜻하다며, 우리 집엔 팔 숯만 있고 땔 숯은 없으니 궁에 가면 안 춥지 않겠냐고 애나의 소매를 당긴다. 샘이 어른이 될 때까지 얼음꽃 알약을 대 주겠다는 대니얼의 말에 애나는 손을 내민다. 궁으로 가는 길에 가짜 아들 연습을 하던 샘은 묻지도 않은 말을 지어낸다. 「아빠는 밤마다 엄마 발을 녹여 줘요.」 애나는 사레가 들리고 대니얼은 귀까지 빨개진다. 두 사람 다 6년 전 얼음 호수의 밤을 떠올리지만, 그 밤의 상대가 서로라는 건 모른다.</w:t>
       </w:r>
     </w:p>
     <w:p>
@@ -6164,7 +6164,7 @@
           <w:b w:val="0"/>
           <w:sz w:val="21"/>
         </w:rPr>
-        <w:t>성문 앞에는 대니얼의 형 제럴드 왕자와 그 아내 모니카, 아들 레오가 기다린다. 제럴드는 6년 전 겨울 궁 밖에 한 발짝도 안 나간 대니얼에게 아들이 있을 리 없다고 하고, 모니카는 시장에서 아무 애나 주워 왔다고 거든다. 국왕은 대니얼이 자기를 속였다면 왕세자 자리를 제럴드에게 넘기겠다고 한다. 그때 샘이, 늙어 몸속 불이 약해진 국왕이 찬 바람에 떠는 걸 보고 달려가 자기 낡은 목도리를 국왕의 목에 감아 준다. 국왕이 목도리를 쥐고 웃는다. 「겁도 없이 왕의 목에 손을 대다니, 대니얼 핏줄이 맞구나!」</w:t>
+        <w:t>성문 앞에는 대니얼의 형 제럴드 왕자와 그 아내 모니카, 아들 레오가 기다린다. 제럴드는 6년 전 겨울 궁 밖에 한 발짝도 안 나간 대니얼에게 아들이 있을 리 없다고 하고, 모니카는 시장에서 아무 애나 주워 왔다고 거든다. 국왕은 대니얼이 자기를 속였다면 왕세자 자리를 제럴드에게 넘기겠다고 한다. 그때 샘이, 늙어 몸속 불이 약해진 국왕이 찬 바람에 떠는 걸 보고 달려가 자기 낡은 목도리를 국왕의 목에 감아 준다. 국왕이 목도리를 쥐고 웃는다. 「겁도 없이 왕의 목에 손을 대다니, 어릴 때 대니얼이랑 똑같구나!」</w:t>
       </w:r>
     </w:p>
     <w:p>
@@ -6193,7 +6193,7 @@
           <w:b w:val="0"/>
           <w:sz w:val="21"/>
         </w:rPr>
-        <w:t>제럴드가 목도리로 핏줄을 어찌 아냐고 대들자, 국왕은 샘의 손을 대니얼의 손 옆에 댄다. 두 새끼손가락이 똑같이 안으로 휘어 있다. 대니얼은 샘이 왜 자기를 닮았는지 속으로 놀란다. 제럴드가 휜 손가락은 시장에 널렸다고 하자, 샘은 이 손가락이 굴뚝 청소엔 최고라고 자랑하다 멈칫한다. 「…아니, 굴뚝새를 제일 잘 잡는다고요.」 국왕은 크게 웃고 애나 집안을 묻는다. 대니얼이 바다 건너 윈터 가문이라고 둘러대자, 샘이 언 창에 눈송이 문양을 지어 그린다. 국왕이 귀족 문양을 다 외운다는 모니카를 돌아보자, 모니카는 처음 보는 문양인데도 자기 어머니가 그 집 잔치에도 갔다고 큰소리친다.</w:t>
+        <w:t>제럴드가 목도리로 핏줄을 어찌 아냐고 대들자, 국왕은 샘의 손을 대니얼의 손 옆에 댄다. 두 새끼손가락이 똑같이 안으로 휘어 있다. 대니얼은 샘이 왜 자기를 닮았는지 속으로 놀란다. 제럴드가 휜 손가락은 시장에 널렸다고 하자, 샘은 이 손가락이 굴뚝 청소엔 최고라고 자랑하다가, 애나가 옆구리를 찌르자 얼른 말을 바꾼다. 「…아니, 할아버지 등 긁어 드리는 데 최고라고요.」 국왕은 크게 웃고 애나 집안을 묻는다. 대니얼이 바다 건너 윈터 가문이라고 둘러대자, 샘이 성에 낀 창에 아무렇게나 눈송이를 그려 놓고 그 집 문양이라고 한다. 국왕이 귀족 문양을 다 외운다는 모니카를 돌아보자, 모니카는 처음 보는 문양인데도 자기 어머니가 그 집 잔치에도 갔다고 큰소리친다.</w:t>
       </w:r>
     </w:p>
     <w:p>
@@ -6207,7 +6207,7 @@
           <w:b w:val="0"/>
           <w:sz w:val="21"/>
         </w:rPr>
-        <w:t>샘이 애나에게 아빠 오게 해 달라고 빌 동전 세 닢은 잘 있다고 속삭이자, 대니얼이 샘의 진짜 아버지는 어디 있냐고 묻는다. 애나는 고래 잡으러 떠나 6년째 안 돌아오는 뱃사람이라고 지어낸다. 대니얼은 그놈을 찾으면 샘 앞에 무릎 꿇려 6년 치 잘못을 빌게 하겠다고 주먹을 쥔다. 그놈이 자기라는 걸 모르는 대니얼을 샘이 올려다본다. 「그럼 아빠도 무릎 꿇어요. 지금은 아빠가 샘 아빠잖아요.」</w:t>
+        <w:t>샘이 애나에게 아빠 오게 해 달라고 빌 동전 세 닢은 잘 있다고 속삭이자, 대니얼이 샘의 진짜 아버지는 어디 있냐고 묻는다. 애나는 고래 잡으러 떠나 6년째 안 돌아오는 뱃사람이라고 지어낸다. 대니얼은 그놈을 찾으면 샘 앞에 무릎 꿇려 6년 치 잘못을 빌게 하겠다고 주먹을 쥔다. 그놈이 자기라는 걸 모르는 대니얼을 샘이 올려다본다. 「그 사람 찾으면 나도 데려가요. 내가 먼저 한 대 때릴래요.」</w:t>
       </w:r>
     </w:p>
     <w:p>
@@ -6236,7 +6236,7 @@
           <w:b w:val="0"/>
           <w:sz w:val="21"/>
         </w:rPr>
-        <w:t>대니얼이 대답을 못 하는 사이, 국왕이 샘을 성 밑 용의 보물 굴로 데려가 조상 용이 모은 금더미 앞에서 두 손에 들 수 있는 만큼 가지라고 한다. 레오가 금더미에 뛰어들며 자기도 왕손이라고 소리치자, 국왕은 레오에게도 가지라고 하고, 레오는 주머니마다 금화를 쑤셔 넣다 무거워서 넘어진다. 샘은 금더미 대신, 국왕이 내내 손을 녹이던 낡은 쇠 상자 속 손톱만 한 불씨를 가리킨다. 샘은 금은 차갑다며, 이 불씨가 안 꺼지게 밤마다 불어서 할아버지 손이 안 시리게 하겠다고 한다. 모니카는 금산을 두고 숯덩이를 고르다니 숯쟁이 자식 같다며 속으로 비웃는다. 그게 사실이라는 건 모니카도 아직 모른다.</w:t>
+        <w:t>대니얼이 웃음을 터뜨리는 사이, 국왕이 샘을 성 밑 용의 보물 굴로 데려가 조상 용이 모은 금더미 앞에서 두 손에 들 수 있는 만큼 가지라고 한다. 레오가 금더미에 뛰어들며 자기도 왕손이라고 소리치자, 국왕은 레오에게도 가지라고 하고, 레오는 주머니마다 금화를 쑤셔 넣다 무거워서 넘어진다. 샘은 금더미 대신, 국왕이 내내 손을 녹이던 낡은 쇠 상자 속 손톱만 한 불씨를 가리킨다. 샘은 금은 차갑다며, 이 불씨가 안 꺼지게 밤마다 불어서 할아버지 손이 안 시리게 하겠다고 한다. 모니카는 금산을 두고 숯덩이를 고르다니 숯쟁이 자식 같다며 속으로 비웃는다. 그게 사실이라는 건 모니카도 아직 모른다.</w:t>
       </w:r>
     </w:p>
     <w:p>
@@ -6293,7 +6293,7 @@
           <w:b w:val="0"/>
           <w:sz w:val="21"/>
         </w:rPr>
-        <w:t>잔치 날 밤, 긴장해 차갑게 언 애나 손을 대니얼이 두 손으로 녹인다. 애나는 그 열이 6년 전 얼음 호수의 그 남자와 똑같아 손을 빼지 못한다. 그때 이미 애나를 구한 사람이 대니얼이라는 건 둘 다 모른다. 샘은 초 바칠 동전 세 닢을 국왕 손에 쥐여 주며, 이제 아빠도 할아버지도 생겨서 안 빌어도 된다고 한다. 국왕은 동전을 왕관 안에 넣고, 대니얼은 몰래 자기 새끼손가락을 샘의 새끼손가락에 대어 본다. 그때 시장에서 돌아온 호위가, 손잡이에 샘이라고 새겨진 굴뚝 솔을 모니카에게 건넨다.</w:t>
+        <w:t>잔치 날 밤, 긴장해 차갑게 언 애나 손을 대니얼이 두 손으로 녹인다. 애나는 그 열이 6년 전 얼음 호수의 그 남자와 똑같아 손을 빼지 못한다. 6년 전 그 남자가 대니얼이라는 건 둘 다 모른다. 샘은 초 바칠 동전 세 닢을 국왕 손에 쥐여 주며, 이제 아빠도 할아버지도 생겨서 안 빌어도 된다고 한다. 국왕은 동전을 왕관 안에 넣고, 대니얼은 몰래 자기 새끼손가락을 샘의 새끼손가락에 대어 본다. 그때 시장에서 돌아온 호위가, 손잡이에 샘이라고 새겨진 굴뚝 솔을 모니카에게 건넨다.</w:t>
       </w:r>
     </w:p>
     <w:p>
@@ -6336,7 +6336,7 @@
           <w:b w:val="0"/>
           <w:sz w:val="21"/>
         </w:rPr>
-        <w:t>그때 대니얼이 들어와 동전 하나를 쥐어 벌겋게 달군 뒤, 던진 귀족에게 떨어뜨렸다며 돌려준다. 귀족이 비명을 지르는 사이, 대니얼은 애나와 샘 사이 돌바닥에 앉아 감자를 집어 든다. 제럴드가 왕가의 수치라고 소리칠 때, 돌아온 국왕도 옆에 앉는다. 「조상 용은 바닥에 엎드려 잤다. 의자에 앉은 용을 본 놈 있느냐.」 국왕이 이 나라는 대니얼이 이끈다고 하자, 귀족들이 무릎을 꿇고 왕세자 만세를 외친다. 그 함성 속에 모니카는 굴뚝 솔을 꽉 쥔다.</w:t>
+        <w:t>그때 대니얼이 들어와 동전 하나를 쥐어 벌겋게 달군 뒤, 떨어뜨리셨다며 동전을 던진 귀족의 손바닥에 올려 준다. 귀족이 비명을 지르는 사이, 대니얼은 애나와 샘 사이 돌바닥에 앉아 감자를 집어 든다. 제럴드가 왕가의 수치라고 소리칠 때, 돌아온 국왕도 옆에 앉는다. 「우리 조상 용은 평생 바닥에 엎드려 살았다. 용의 자손이 바닥에 앉는 게 뭐가 수치냐.」 국왕이 이 나라는 대니얼이 이끈다고 하자, 귀족들이 무릎을 꿇고 왕세자 만세를 외친다. 그 함성 속에 모니카는 굴뚝 솔을 꽉 쥔다.</w:t>
       </w:r>
     </w:p>
     <w:p>
@@ -6365,7 +6365,7 @@
           <w:b w:val="0"/>
           <w:sz w:val="21"/>
         </w:rPr>
-        <w:t>함성이 잦아들자 모니카가 굴뚝 솔을 국왕 발 앞에 던진다. 모니카는 애나가 숯 장수, 샘이 이 솔로 굴뚝을 닦는 사생아고, 자기가 안다던 윈터 가문 문양도 샘이 지어 그린 그림이라고 한다. 모니카는 거짓이면 자기 손을 용 불꽃에 넣겠다고 맹세하고, 프랭크와 브록까지 불러 두었다. 국왕이 샘이 정말 네 아들이냐고 묻고, 대니얼이 설명하려고 입을 떼자 국왕은 샘의 품에서 불씨 상자를 빼앗는다. 샘은 국왕의 옷자락에 매달려, 상자가 없으면 할아버지 손이 시리다고 운다.</w:t>
+        <w:t>함성이 잦아들자 모니카가 굴뚝 솔을 국왕 발 앞에 던진다. 모니카는 애나가 숯 장수, 샘이 이 솔로 굴뚝을 닦는 사생아고, 윈터 가문은 있지도 않은 집안이라고 한다. 모니카는 거짓이면 자기 손을 용 불꽃에 넣겠다고 맹세하고, 프랭크와 브록까지 불러 두었다. 국왕이 샘이 정말 네 아들이냐고 묻고, 대니얼이 설명하려고 입을 떼자 국왕은 샘의 품에서 불씨 상자를 빼앗는다. 샘은 국왕의 옷자락에 매달려, 상자가 없으면 할아버지 손이 시리다고 운다.</w:t>
       </w:r>
     </w:p>
     <w:p>
@@ -6750,7 +6750,7 @@
           <w:b w:val="0"/>
           <w:sz w:val="21"/>
         </w:rPr>
-        <w:t>닭싸움 내기로 진 빚 금화 이백 닢 대신 친오빠 셋에게 팔려, 아내를 셋이나 묻은 늙은 백작과 혼례를 올린 열아홉 살 로즈. 아버지가 죽은 뒤 막내를 키운다며 하녀처럼 부려 온 첫째 칼과 둘째 웨이드, 셋째 릭이 받은 값이다. 첫날밤 백작의 침실 창문으로 뛰어내린 로즈가 숲으로 달아나자, 오빠들은 백작의 사냥개를 끌고 뒤쫓는다. 로즈가 숨어든 불 꺼진 빈 오두막에는 멧돼지에게 팔을 베인 왕세자 줄리언이 홀로 숨어 있다. 피가 잘 멈추지 않는 병을 들키지 않으려고 호위까지 물린 것이다. 로즈는 혼례 베일을 찢어 그 팔을 동여맨다.</w:t>
+        <w:t>친오빠 셋이 닭싸움 내기로 진 빚 금화 이백 닢 대신 팔려, 아내를 셋이나 묻은 늙은 백작과 혼례를 올린 열아홉 살 로즈. 아버지가 죽은 뒤 막내를 키운다며 하녀처럼 부려 온 첫째 칼과 둘째 웨이드, 셋째 릭이 받은 값이다. 첫날밤 백작의 침실 창문으로 뛰어내린 로즈가 숲으로 달아나자, 오빠들은 백작의 사냥개를 끌고 뒤쫓는다. 로즈가 숨어든 불 꺼진 사냥 오두막에는 멧돼지에게 팔을 베인 왕세자 줄리언이 홀로 숨어 있다. 피가 잘 멈추지 않는 병을 들키지 않으려고 호위까지 물린 것이다. 로즈는 혼례 베일을 찢어 그 팔을 동여맨다.</w:t>
       </w:r>
     </w:p>
     <w:p>
@@ -6764,7 +6764,7 @@
           <w:b w:val="0"/>
           <w:sz w:val="21"/>
         </w:rPr>
-        <w:t>사냥개가 문 앞에서 짖어 대자 줄리언은 두건을 쓰고 나가 오빠들 발밑에 금화 주머니를 던진다. 주머니를 열어 본 칼은 백작 값보다 많다며, 동생은 하룻밤이든 평생이든 데려가라고 웃으며 돌아선다. 캄캄해서 서로 얼굴도 못 본 채, 로즈는 하룻밤에 자기를 두 번 판 오빠들의 웃음소리를 듣는다. 그가 왕세자라는 것도 로즈는 모른다. 오빠들이 또 자기를 팔 걸 아는 로즈가 남자의 외투를 움켜쥔다. 「또 팔려 가기 전에, 오늘 밤 남자는 내가 고를래요.」</w:t>
+        <w:t>사냥개가 문 앞에서 짖어 대자 줄리언은 두건을 쓰고 나가 오빠들 발밑에 금화 주머니를 던진다. 주머니를 열어 본 칼은 백작 값보다 많다며, 동생은 하룻밤이든 평생이든 데려가라고 웃으며 돌아선다. 캄캄해서 서로 얼굴도 못 본 채, 로즈는 하룻밤에 자기를 두 번 판 오빠들의 웃음소리를 듣는다. 그가 왕세자라는 것도 로즈는 모른다. 오빠들이 또 자기를 팔 걸 아는 로즈가 남자의 외투를 움켜쥔다. 「어차피 또 팔려 갈 거면, 첫날밤 상대는 내가 고를래요.」</w:t>
       </w:r>
     </w:p>
     <w:p>
@@ -6807,7 +6807,7 @@
           <w:b w:val="0"/>
           <w:sz w:val="21"/>
         </w:rPr>
-        <w:t>그날 강가 빨래터에, 줄리언의 금화마저 닭싸움 판에서 날린 오빠 셋이 나타난다. 칼은 찰리의 은단추를 보고 금화 던지고 간 놈도 하룻밤 놀고 버린 거라며 비웃고, 웨이드는 로즈의 앞치마에서 약값 주머니를 뜯어 간다. 그래도 빚이 모자라자 칼은 굴뚝 청소꾼에게 찰리를 팔기로 하고, 릭이 버둥대는 찰리를 강가 자갈밭에 내던진다. 무릎에서 피가 멈추지 않는 찰리를 릭이 수레에 던져 올리려는 순간, 누군가 말에서 뛰어내려 릭의 손목을 붙잡는다.</w:t>
+        <w:t>그날 강가 빨래터에, 6년 전 그 남자가 던진 금화마저 닭싸움 판에서 날린 오빠 셋이 나타난다. 칼은 찰리의 은단추를 보고 금화 던지고 간 놈도 하룻밤 놀고 버린 거라며 비웃고, 웨이드는 로즈의 앞치마에서 약값 주머니를 뜯어 간다. 그래도 빚이 모자라자 칼은 굴뚝 청소꾼에게 찰리를 팔기로 하고, 릭이 버둥대는 찰리를 강가 자갈밭에 내던진다. 무릎에서 피가 멈추지 않는 찰리를 릭이 수레에 던져 올리려는 순간, 누군가 말에서 뛰어내려 릭의 손목을 붙잡는다.</w:t>
       </w:r>
     </w:p>
     <w:p>
@@ -6836,7 +6836,7 @@
           <w:b w:val="0"/>
           <w:sz w:val="21"/>
         </w:rPr>
-        <w:t>릭의 손목을 비틀어 쥔 사람은, 피 멎는 약초를 구하러 몰래 강 건너 도시에 나온 왕세자 줄리언이다. 줄리언이 품에서 꺼낸 약초 가루를 찰리의 무릎에 꾹 누르자 피가 겨우 멎는다. 줄리언은 로즈에게만 들리게, 자기도 같은 병이라 이 가루를 늘 품고 다니지만 깊이 베인 상처엔 소용이 없다고 말한다. 처음 보는 얼굴인데 목소리가 이상하게 귀에 익어 로즈는 대답을 못 한다. 찰리는 삼촌들 앞에서 줄리언 다리에 매달려 우리 아빠가 왔다고 소리친다. 칼이 아비라면 이 꼬마 값을 대신 치르라고 손을 내밀자, 호위가 뽑은 검자루의 왕세자 문장을 본 오빠들이 무릎을 꿇는다. 줄리언이 찰리를 안아 든다. 「내 아들 값은 너희 셋이 광산에서 평생 돌을 캐서 치러라.」</w:t>
+        <w:t>릭의 손목을 비틀어 쥔 사람은, 피 멎는 약초를 구하러 몰래 강 건너 도시에 나온 왕세자 줄리언이다. 줄리언이 품에서 꺼낸 약초 가루를 찰리의 무릎에 꾹 누르자 피가 겨우 멎는다. 줄리언은 로즈에게만 들리게, 자기도 같은 병이라 이 가루를 늘 품고 다니지만 깊이 베인 상처엔 소용이 없다고 말한다. 처음 보는 얼굴인데 목소리가 이상하게 귀에 익어 로즈는 대답을 못 한다. 찰리는 삼촌들 앞에서 줄리언 다리에 매달려 우리 아빠가 왔다고 소리친다. 칼이 아비라면 이 꼬마 값을 대신 치르라고 손을 내밀자, 뒤따라온 호위가 칼을 뽑고, 칼자루에 새긴 왕세자 문장을 본 오빠들이 무릎을 꿇는다. 줄리언이 찰리를 안아 든다. 「내 아들 값은 너희 셋이 광산에서 평생 돌을 캐서 치러라.」</w:t>
       </w:r>
     </w:p>
     <w:p>
@@ -6850,7 +6850,7 @@
           <w:b w:val="0"/>
           <w:sz w:val="21"/>
         </w:rPr>
-        <w:t>오빠들이 달아나자 로즈는 왕세자에게 거짓말한 찰리의 귀를 잡아당기고, 평생 전하의 옷을 빨아 은혜를 갚겠다며 고개를 숙인다. 6년 전 불 꺼진 오두막의 상대가 서로라는 걸 두 사람은 모른다. 국왕은 봄 축제 날까지 줄리언이 손주를 못 보이면 형 그레고리의 아들 맥스를 다음 왕으로 세우겠다고 했고, 축제는 한 달 뒤다. 왕세자에게 아빠라고 외친 배짱 좋은 아이를 내려다보던 줄리언이 로즈에게 말한다. 「한 달만 내 아들의 엄마가 되어 주시오.」</w:t>
+        <w:t>오빠들이 달아나자 로즈는 왕세자에게 거짓말한 찰리의 귀를 잡아당기고, 평생 전하의 옷을 빨아 은혜를 갚겠다며 고개를 숙인다. 6년 전 불 꺼진 오두막의 상대가 서로라는 걸 두 사람은 모른다. 결혼하라고 몰아붙이는 국왕에게 숨겨 둔 아들이 있다고 둘러댄 줄리언은, 봄 축제 날까지 그 아들을 데려가지 못하면 형 그레고리의 아들 맥스에게 다음 왕위를 넘겨야 한다. 축제는 한 달 뒤다. 왕세자에게 아빠라고 외친 배짱 좋은 아이를 내려다보던 줄리언이 로즈에게 말한다. 「한 달만 내 아들의 엄마가 되어 주시오.」</w:t>
       </w:r>
     </w:p>
     <w:p>
@@ -6922,7 +6922,7 @@
           <w:b w:val="0"/>
           <w:sz w:val="21"/>
         </w:rPr>
-        <w:t>그레고리는 시장 아이들 절반이 그런 머리라며 코웃음을 친다. 국왕이 손을 뻗어, 줄리언이 매일 아침 기름으로 눌러 붙이는 머리를 헝클어뜨리자 같은 자리에서 머리카락 한 줌이 솟는다. 줄리언은 이 아이가 왜 자기를 닮았는지 의아해한다. 가짜인 게 들킬까 봐 겁이 난 찰리가 국왕 앞으로 나선다. 「이 머리는 할아버지한테 인사하려고 선 거예요.」 크게 웃던 국왕이 로즈에게 어느 집 딸이냐고 묻자, 줄리언은 이웃 나라 그레이 가문 딸이고 작년 그 나라 무도회에서 헬렌과 한 식탁에 앉았다고 둘러댄다. 그 나라 무도회는 한 번도 빠진 적 없다고 자랑해 온 헬렌이 답한다. 「그럼요, 푸른 드레스 입었던 아가씨잖아요.」 로즈는 푸른 드레스를 입어 본 적이 없다.</w:t>
+        <w:t>그레고리는 시장 아이들 절반이 그런 머리라며 코웃음을 친다. 국왕이 손을 뻗어, 줄리언이 매일 아침 기름으로 눌러 붙이는 머리를 헝클어뜨리자 같은 자리에서 머리카락 한 줌이 솟는다. 줄리언은 이 아이가 왜 자기를 닮았는지 의아해한다. 가짜인 게 들킬까 봐 겁이 난 찰리가 국왕 앞으로 나선다. 「이 머리는 할아버지한테 인사하려고 선 거예요.」 크게 웃던 국왕이 로즈에게 어느 집 딸이냐고 묻자, 줄리언은 이웃 나라 그레이 가문 딸이고 작년 그 나라 무도회에서 헬렌과 한 식탁에 앉았다고 둘러댄다. 그 나라 무도회는 한 번도 빠진 적 없다고 자랑해 온 헬렌은, 모른다고 할 수 없어 아는 척을 한다. 「그럼요, 푸른 드레스 입었던 아가씨잖아요.」 로즈는 푸른 드레스를 입어 본 적이 없다.</w:t>
       </w:r>
     </w:p>
     <w:p>
@@ -7051,7 +7051,7 @@
           <w:b w:val="0"/>
           <w:sz w:val="21"/>
         </w:rPr>
-        <w:t>기다리다 못한 헬렌이 일부러 포도주를 엎어 로즈의 비단 장갑을 적시자, 하인이 손 씻을 은대야를 내오고 로즈는 사람들 앞에서 장갑을 벗는다. 6년 동안 강물에 빨래를 하느라 갈라지고 벌겋게 튼 손이 드러나자, 귀족들은 이웃 나라 귀족 딸 손이 빨래꾼 손 같다며 웃는다. 맥스는 찰리 목에서 은단추 끈을 낚아채 포도주가 섞인 대야에 던지고, 찰리는 소매째 팔을 넣어 단추를 건지며 아빠 단추라고 소리친다. 로즈는 갈라진 손을 치마 뒤로 숨긴 채 젖은 찰리를 끌어안는다.</w:t>
+        <w:t>은검이 들어오기 전에 로즈부터 망신을 주려고, 헬렌이 일부러 포도주를 엎어 로즈의 비단 장갑을 적시자, 하인이 손 씻을 은대야를 내오고 로즈는 사람들 앞에서 장갑을 벗는다. 6년 동안 강물에 빨래를 하느라 갈라지고 벌겋게 튼 손이 드러나자, 귀족들은 이웃 나라 귀족 딸 손이 빨래꾼 손 같다며 웃는다. 맥스는 찰리 목에서 은단추 끈을 낚아채 포도주가 섞인 대야에 던지고, 찰리는 소매째 팔을 넣어 단추를 건지며 아빠 단추라고 소리친다. 로즈는 갈라진 손을 치마 뒤로 숨긴 채 젖은 찰리를 끌어안는다.</w:t>
       </w:r>
     </w:p>
     <w:p>
@@ -7065,7 +7065,7 @@
           <w:b w:val="0"/>
           <w:sz w:val="21"/>
         </w:rPr>
-        <w:t>줄리언이 장갑을 벗고 대야 앞에 무릎을 꿇더니, 모두가 보는 앞에서 로즈의 손을 붉은 물에 담가 씻긴다. 「이 손이 내 아들을 혼자 키운 손이다.」 그레고리가 왕세자가 빨래꾼 흉내를 낸다고 소리치자, 꽃 왕관을 쓴 국왕이 일어나 장갑을 벗는다. 국왕은 젊어서 전장에 나갔을 때 자기 목숨을 지켜 준 병사들 손도 다 이렇게 갈라져 있었다며 같은 대야에 손을 넣는다. 「이 물에 손을 못 넣는 자는 내 식탁에 앉지 마라.」 귀족들이 앞다투어 대야에 손을 담그고 줄리언 앞에 고개를 숙이는 사이, 헬렌은 시녀에게 오빠들을 데려오라고 눈짓한다.</w:t>
+        <w:t>줄리언이 장갑을 벗고 대야 앞에 무릎을 꿇더니, 모두가 보는 앞에서 로즈의 손을 포도주로 붉어진 대야 물에 담가 씻긴다. 「이 손이 내 아들을 혼자 키운 손이다.」 그레고리가 왕세자가 빨래꾼 흉내를 낸다고 소리치자, 꽃 왕관을 쓴 국왕이 일어나 장갑을 벗는다. 국왕은 젊어서 전장에 나갔을 때 자기 목숨을 지켜 준 병사들 손도 다 이렇게 갈라져 있었다며 같은 대야에 손을 넣는다. 「이 물에 손을 못 넣는 자는 내 식탁에 앉지 마라.」 귀족들이 앞다투어 대야에 손을 담그고 줄리언 앞에 고개를 숙이는 사이, 헬렌은 시녀에게 오빠들을 데려오라고 눈짓한다.</w:t>
       </w:r>
     </w:p>
     <w:p>
@@ -7094,7 +7094,7 @@
           <w:b w:val="0"/>
           <w:sz w:val="21"/>
         </w:rPr>
-        <w:t>귀족들이 다시 자리에 앉자 헬렌이 국왕 앞에 나선다. 로즈는 귀족 딸이 아니라 강가 빨래꾼이고 찰리는 아비도 모르는 아이이며, 푸른 드레스도 자기가 속아서 한 말이라는 것이다. 헬렌은 거짓이면 맥스의 왕위 계승 자격을 내놓겠다고 맹세하고, 로즈를 판 오빠 셋이 문밖에 와 있다고 덧붙인다. 국왕이 찰리가 정말 네 아들이냐고 묻자 줄리언은 무릎을 꿇고 설명하려 하지만, 국왕은 듣지도 않고 줄리언의 왕세자 띠를 끊어 내던진다. 그레고리가 예배당에서 첫 왕의 은검을 가져오고, 맥스가 먼저 칼날을 쥐었다 놓자 피가 묻은 글자가 환하게 빛난다.</w:t>
+        <w:t>귀족들이 다시 자리에 앉자 헬렌이 국왕 앞에 나선다. 로즈는 귀족 딸이 아니라 강가 빨래꾼이고 찰리는 아비도 모르는 아이이며, 푸른 드레스 이야기도 줄리언의 말에 맞춰 준 것뿐이라는 것이다. 헬렌은 거짓이면 맥스의 왕위 계승 자격을 내놓겠다고 맹세하고, 로즈를 판 오빠 셋이 문밖에 와 있다고 덧붙인다. 국왕이 찰리가 정말 네 아들이냐고 묻자 줄리언은 무릎을 꿇고 설명하려 하지만, 국왕은 듣지도 않고 줄리언의 왕세자 띠를 끊어 내던진다. 그레고리가 예배당에서 첫 왕의 은검을 가져오고, 맥스가 먼저 칼날을 쥐었다 놓자 피가 묻은 글자가 환하게 빛난다.</w:t>
       </w:r>
     </w:p>
     <w:p>

</xml_diff>